<commit_message>
Update environment config and documentation
</commit_message>
<xml_diff>
--- a/DecisionFormation_OwnersManual.docx
+++ b/DecisionFormation_OwnersManual.docx
@@ -69,71 +69,7 @@
                 <w:sz w:val="14"/>
                 <w:szCs w:val="14"/>
               </w:rPr>
-              <w:t xml:space="preserve">OWNER'S </w:t>
-            </w:r>
-            <w:r>
-              <w:rPr>
-                <w:rFonts w:ascii="Arial" w:eastAsia="Arial" w:hAnsi="Arial" w:cs="Arial"/>
-                <w:color w:val="888880"/>
-                <w:spacing w:val="60"/>
-                <w:sz w:val="14"/>
-                <w:szCs w:val="14"/>
-              </w:rPr>
-              <w:t xml:space="preserve">MANUAL </w:t>
-            </w:r>
-            <w:proofErr w:type="gramStart"/>
-            <w:r>
-              <w:rPr>
-                <w:rFonts w:ascii="Arial" w:eastAsia="Arial" w:hAnsi="Arial" w:cs="Arial"/>
-                <w:color w:val="888880"/>
-                <w:spacing w:val="60"/>
-                <w:sz w:val="14"/>
-                <w:szCs w:val="14"/>
-              </w:rPr>
-              <w:t>·</w:t>
-            </w:r>
-            <w:r>
-              <w:rPr>
-                <w:rFonts w:ascii="Arial" w:eastAsia="Arial" w:hAnsi="Arial" w:cs="Arial"/>
-                <w:color w:val="888880"/>
-                <w:spacing w:val="60"/>
-                <w:sz w:val="14"/>
-                <w:szCs w:val="14"/>
-              </w:rPr>
-              <w:t xml:space="preserve">  VERSION</w:t>
-            </w:r>
-            <w:proofErr w:type="gramEnd"/>
-            <w:r>
-              <w:rPr>
-                <w:rFonts w:ascii="Arial" w:eastAsia="Arial" w:hAnsi="Arial" w:cs="Arial"/>
-                <w:color w:val="888880"/>
-                <w:spacing w:val="60"/>
-                <w:sz w:val="14"/>
-                <w:szCs w:val="14"/>
-              </w:rPr>
-              <w:t xml:space="preserve"> </w:t>
-            </w:r>
-            <w:proofErr w:type="gramStart"/>
-            <w:r>
-              <w:rPr>
-                <w:rFonts w:ascii="Arial" w:eastAsia="Arial" w:hAnsi="Arial" w:cs="Arial"/>
-                <w:color w:val="888880"/>
-                <w:spacing w:val="60"/>
-                <w:sz w:val="14"/>
-                <w:szCs w:val="14"/>
-              </w:rPr>
-              <w:t>1.0  ·</w:t>
-            </w:r>
-            <w:proofErr w:type="gramEnd"/>
-            <w:r>
-              <w:rPr>
-                <w:rFonts w:ascii="Arial" w:eastAsia="Arial" w:hAnsi="Arial" w:cs="Arial"/>
-                <w:color w:val="888880"/>
-                <w:spacing w:val="60"/>
-                <w:sz w:val="14"/>
-                <w:szCs w:val="14"/>
-              </w:rPr>
-              <w:t xml:space="preserve">  MARCH 2026</w:t>
+              <w:t>OWNER'S MANUAL ·  VERSION 1.0  ·  MARCH 2026</w:t>
             </w:r>
           </w:p>
         </w:tc>
@@ -166,29 +102,7 @@
                 <w:sz w:val="14"/>
                 <w:szCs w:val="14"/>
               </w:rPr>
-              <w:t xml:space="preserve">KORUM </w:t>
-            </w:r>
-            <w:proofErr w:type="gramStart"/>
-            <w:r>
-              <w:rPr>
-                <w:rFonts w:ascii="Arial" w:eastAsia="Arial" w:hAnsi="Arial" w:cs="Arial"/>
-                <w:color w:val="C9A84C"/>
-                <w:spacing w:val="40"/>
-                <w:sz w:val="14"/>
-                <w:szCs w:val="14"/>
-              </w:rPr>
-              <w:t>LAB  ·</w:t>
-            </w:r>
-            <w:proofErr w:type="gramEnd"/>
-            <w:r>
-              <w:rPr>
-                <w:rFonts w:ascii="Arial" w:eastAsia="Arial" w:hAnsi="Arial" w:cs="Arial"/>
-                <w:color w:val="C9A84C"/>
-                <w:spacing w:val="40"/>
-                <w:sz w:val="14"/>
-                <w:szCs w:val="14"/>
-              </w:rPr>
-              <w:t xml:space="preserve">  INTERNAL</w:t>
+              <w:t>KORUM LAB  ·  INTERNAL</w:t>
             </w:r>
           </w:p>
         </w:tc>
@@ -687,6 +601,341 @@
           <w:sz w:val="16"/>
           <w:szCs w:val="16"/>
         </w:rPr>
+        <w:t>QUICK START — DASHBOARD WORKFLOW</w:t>
+      </w:r>
+    </w:p>
+    <w:p>
+      <w:pPr>
+        <w:spacing w:before="40" w:after="40"/>
+      </w:pPr>
+      <w:r>
+        <w:rPr>
+          <w:rFonts w:ascii="Arial" w:eastAsia="Arial" w:hAnsi="Arial" w:cs="Arial"/>
+          <w:color w:val="2C2C2A"/>
+        </w:rPr>
+        <w:t>This is the procedure for booting up the lab day to day. Everything runs on your own machine — you should never need to visit Neo4j’s website or sign in to anything online for this.</w:t>
+      </w:r>
+    </w:p>
+    <w:tbl>
+      <w:tblPr>
+        <w:tblW w:w="9360" w:type="dxa"/>
+        <w:tblBorders>
+          <w:top w:val="none" w:sz="0" w:space="0" w:color="FFFFFF"/>
+          <w:left w:val="single" w:sz="12" w:space="0" w:color="C9A84C"/>
+          <w:bottom w:val="none" w:sz="0" w:space="0" w:color="FFFFFF"/>
+          <w:right w:val="none" w:sz="0" w:space="0" w:color="FFFFFF"/>
+          <w:insideH w:val="single" w:sz="4" w:space="0" w:color="auto"/>
+          <w:insideV w:val="single" w:sz="4" w:space="0" w:color="auto"/>
+        </w:tblBorders>
+        <w:tblCellMar>
+          <w:left w:w="10" w:type="dxa"/>
+          <w:right w:w="10" w:type="dxa"/>
+        </w:tblCellMar>
+        <w:tblLook w:val="04A0" w:firstRow="1" w:lastRow="0" w:firstColumn="1" w:lastColumn="0" w:noHBand="0" w:noVBand="1"/>
+      </w:tblPr>
+      <w:tblGrid>
+        <w:gridCol w:w="9360"/>
+      </w:tblGrid>
+      <w:tr>
+        <w:tblPrEx>
+          <w:tblCellMar>
+            <w:top w:w="0" w:type="dxa"/>
+            <w:bottom w:w="0" w:type="dxa"/>
+          </w:tblCellMar>
+        </w:tblPrEx>
+        <w:tc>
+          <w:tcPr>
+            <w:tcW w:w="9360" w:type="dxa"/>
+            <w:tcBorders>
+              <w:top w:val="none" w:sz="0" w:space="0" w:color="FFFFFF"/>
+              <w:left w:val="none" w:sz="0" w:space="0" w:color="FFFFFF"/>
+              <w:bottom w:val="none" w:sz="0" w:space="0" w:color="FFFFFF"/>
+              <w:right w:val="none" w:sz="0" w:space="0" w:color="FFFFFF"/>
+            </w:tcBorders>
+            <w:shd w:val="clear" w:color="auto" w:fill="FBF6E9"/>
+            <w:tcMar>
+              <w:top w:w="100" w:type="dxa"/>
+              <w:left w:w="220" w:type="dxa"/>
+              <w:bottom w:w="100" w:type="dxa"/>
+              <w:right w:w="160" w:type="dxa"/>
+            </w:tcMar>
+          </w:tcPr>
+          <w:p>
+            <w:pPr>
+              <w:spacing w:after="40"/>
+            </w:pPr>
+            <w:r>
+              <w:rPr>
+                <w:rFonts w:ascii="Arial" w:eastAsia="Arial" w:hAnsi="Arial" w:cs="Arial"/>
+                <w:b/>
+                <w:bCs/>
+                <w:color w:val="C9A84C"/>
+                <w:spacing w:val="60"/>
+                <w:sz w:val="15"/>
+                <w:szCs w:val="15"/>
+              </w:rPr>
+              <w:t>BEFORE YOU START — ONLY ONE NEO4J MAY RUN</w:t>
+            </w:r>
+          </w:p>
+          <w:p>
+            <w:pPr>
+              <w:spacing w:after="40"/>
+            </w:pPr>
+            <w:r>
+              <w:rPr>
+                <w:rFonts w:ascii="Arial" w:eastAsia="Arial" w:hAnsi="Arial" w:cs="Arial"/>
+                <w:color w:val="2C2C2A"/>
+              </w:rPr>
+              <w:t>This machine has two separate local Neo4j setups that both want port 7687: Docker (decisionformation-neo4j-1 — the one this app actually uses, neo4j / korumlab123, database neo4j) and Neo4j Desktop (an instance named “korum-lab” with a database literally called korumlab — the original setup from months ago, still holding real data but no longer used by the app).</w:t>
+            </w:r>
+          </w:p>
+          <w:p>
+            <w:r>
+              <w:rPr>
+                <w:rFonts w:ascii="Arial" w:eastAsia="Arial" w:hAnsi="Arial" w:cs="Arial"/>
+                <w:b/>
+                <w:bCs/>
+                <w:color w:val="2C2C2A"/>
+              </w:rPr>
+              <w:t>Before launching, open Neo4j Desktop and make sure “korum-lab” is STOPPED</w:t>
+            </w:r>
+            <w:r>
+              <w:rPr>
+                <w:rFonts w:ascii="Arial" w:eastAsia="Arial" w:hAnsi="Arial" w:cs="Arial"/>
+                <w:color w:val="2C2C2A"/>
+              </w:rPr>
+              <w:t xml:space="preserve"> — otherwise the dashboard fails with a Neo4j “Unauthorized” error that has nothing to do with your actual password; it’s just talking to the wrong Neo4j.</w:t>
+            </w:r>
+          </w:p>
+        </w:tc>
+      </w:tr>
+    </w:tbl>
+    <w:p>
+      <w:pPr>
+        <w:spacing w:before="160" w:after="60"/>
+      </w:pPr>
+      <w:r>
+        <w:rPr>
+          <w:rFonts w:ascii="Arial" w:eastAsia="Arial" w:hAnsi="Arial" w:cs="Arial"/>
+          <w:b/>
+          <w:bCs/>
+          <w:color w:val="2C2C2A"/>
+          <w:sz w:val="22"/>
+          <w:szCs w:val="22"/>
+        </w:rPr>
+        <w:t>Startup Steps</w:t>
+      </w:r>
+    </w:p>
+    <w:p>
+      <w:pPr>
+        <w:spacing w:before="40" w:after="40"/>
+        <w:ind w:left="360" w:hanging="360"/>
+      </w:pPr>
+      <w:r>
+        <w:rPr>
+          <w:rFonts w:ascii="Arial" w:eastAsia="Arial" w:hAnsi="Arial" w:cs="Arial"/>
+          <w:b/>
+          <w:bCs/>
+          <w:color w:val="C9A84C"/>
+          <w:sz w:val="20"/>
+          <w:szCs w:val="20"/>
+        </w:rPr>
+        <w:t xml:space="preserve">1. </w:t>
+      </w:r>
+      <w:r>
+        <w:rPr>
+          <w:rFonts w:ascii="Arial" w:eastAsia="Arial" w:hAnsi="Arial" w:cs="Arial"/>
+          <w:color w:val="2C2C2A"/>
+        </w:rPr>
+        <w:t>Open Docker Desktop and wait for it to fully start.</w:t>
+      </w:r>
+    </w:p>
+    <w:p>
+      <w:pPr>
+        <w:spacing w:before="40" w:after="40"/>
+        <w:ind w:left="360" w:hanging="360"/>
+      </w:pPr>
+      <w:r>
+        <w:rPr>
+          <w:rFonts w:ascii="Arial" w:eastAsia="Arial" w:hAnsi="Arial" w:cs="Arial"/>
+          <w:b/>
+          <w:bCs/>
+          <w:color w:val="C9A84C"/>
+          <w:sz w:val="20"/>
+          <w:szCs w:val="20"/>
+        </w:rPr>
+        <w:t xml:space="preserve">2. </w:t>
+      </w:r>
+      <w:r>
+        <w:rPr>
+          <w:rFonts w:ascii="Arial" w:eastAsia="Arial" w:hAnsi="Arial" w:cs="Arial"/>
+          <w:color w:val="2C2C2A"/>
+        </w:rPr>
+        <w:t>Check Neo4j Desktop → Local instances — if “korum-lab” shows RUNNING, stop it.</w:t>
+      </w:r>
+    </w:p>
+    <w:p>
+      <w:pPr>
+        <w:spacing w:before="40" w:after="40"/>
+        <w:ind w:left="360" w:hanging="360"/>
+      </w:pPr>
+      <w:r>
+        <w:rPr>
+          <w:rFonts w:ascii="Arial" w:eastAsia="Arial" w:hAnsi="Arial" w:cs="Arial"/>
+          <w:b/>
+          <w:bCs/>
+          <w:color w:val="C9A84C"/>
+          <w:sz w:val="20"/>
+          <w:szCs w:val="20"/>
+        </w:rPr>
+        <w:t xml:space="preserve">3. </w:t>
+      </w:r>
+      <w:r>
+        <w:rPr>
+          <w:rFonts w:ascii="Arial" w:eastAsia="Arial" w:hAnsi="Arial" w:cs="Arial"/>
+          <w:color w:val="2C2C2A"/>
+        </w:rPr>
+        <w:t>Double-click start_korum.bat in this folder. It opens three windows and spins up Neo4j + the FastAPI backend in Docker, the Python API natively on http://127.0.0.1:8000, and the Vite dashboard on http://localhost:5173.</w:t>
+      </w:r>
+    </w:p>
+    <w:p>
+      <w:pPr>
+        <w:spacing w:before="40" w:after="40"/>
+        <w:ind w:left="360" w:hanging="360"/>
+      </w:pPr>
+      <w:r>
+        <w:rPr>
+          <w:rFonts w:ascii="Arial" w:eastAsia="Arial" w:hAnsi="Arial" w:cs="Arial"/>
+          <w:b/>
+          <w:bCs/>
+          <w:color w:val="C9A84C"/>
+          <w:sz w:val="20"/>
+          <w:szCs w:val="20"/>
+        </w:rPr>
+        <w:t xml:space="preserve">4. </w:t>
+      </w:r>
+      <w:r>
+        <w:rPr>
+          <w:rFonts w:ascii="Arial" w:eastAsia="Arial" w:hAnsi="Arial" w:cs="Arial"/>
+          <w:color w:val="2C2C2A"/>
+        </w:rPr>
+        <w:t>Open http://localhost:5173 — that’s the dashboard (“Korum Lab Console”). Paste in a decision scenario and click Extract Insights, then optionally Red Team Attack → Governor Resolve.</w:t>
+      </w:r>
+    </w:p>
+    <w:p>
+      <w:pPr>
+        <w:spacing w:before="40" w:after="40"/>
+        <w:ind w:left="360" w:hanging="360"/>
+      </w:pPr>
+      <w:r>
+        <w:rPr>
+          <w:rFonts w:ascii="Arial" w:eastAsia="Arial" w:hAnsi="Arial" w:cs="Arial"/>
+          <w:b/>
+          <w:bCs/>
+          <w:color w:val="C9A84C"/>
+          <w:sz w:val="20"/>
+          <w:szCs w:val="20"/>
+        </w:rPr>
+        <w:t xml:space="preserve">5. </w:t>
+      </w:r>
+      <w:r>
+        <w:rPr>
+          <w:rFonts w:ascii="Arial" w:eastAsia="Arial" w:hAnsi="Arial" w:cs="Arial"/>
+          <w:color w:val="2C2C2A"/>
+        </w:rPr>
+        <w:t>To see the actual graph, open http://localhost:7474/browser/ by typing that exact address — don’t search “Neo4j” and click into the marketing site, you want your own local instance, not Neo4j Aura. Log in with neo4j / korumlab123 (database neo4j), then run: MATCH (n)-[r]-&gt;(m) RETURN n, r, m LIMIT 100</w:t>
+      </w:r>
+    </w:p>
+    <w:tbl>
+      <w:tblPr>
+        <w:tblW w:w="9360" w:type="dxa"/>
+        <w:tblBorders>
+          <w:top w:val="none" w:sz="0" w:space="0" w:color="FFFFFF"/>
+          <w:left w:val="single" w:sz="12" w:space="0" w:color="C9A84C"/>
+          <w:bottom w:val="none" w:sz="0" w:space="0" w:color="FFFFFF"/>
+          <w:right w:val="none" w:sz="0" w:space="0" w:color="FFFFFF"/>
+          <w:insideH w:val="single" w:sz="4" w:space="0" w:color="auto"/>
+          <w:insideV w:val="single" w:sz="4" w:space="0" w:color="auto"/>
+        </w:tblBorders>
+        <w:tblCellMar>
+          <w:left w:w="10" w:type="dxa"/>
+          <w:right w:w="10" w:type="dxa"/>
+        </w:tblCellMar>
+        <w:tblLook w:val="04A0" w:firstRow="1" w:lastRow="0" w:firstColumn="1" w:lastColumn="0" w:noHBand="0" w:noVBand="1"/>
+      </w:tblPr>
+      <w:tblGrid>
+        <w:gridCol w:w="9360"/>
+      </w:tblGrid>
+      <w:tr>
+        <w:tblPrEx>
+          <w:tblCellMar>
+            <w:top w:w="0" w:type="dxa"/>
+            <w:bottom w:w="0" w:type="dxa"/>
+          </w:tblCellMar>
+        </w:tblPrEx>
+        <w:tc>
+          <w:tcPr>
+            <w:tcW w:w="9360" w:type="dxa"/>
+            <w:tcBorders>
+              <w:top w:val="none" w:sz="0" w:space="0" w:color="FFFFFF"/>
+              <w:left w:val="none" w:sz="0" w:space="0" w:color="FFFFFF"/>
+              <w:bottom w:val="none" w:sz="0" w:space="0" w:color="FFFFFF"/>
+              <w:right w:val="none" w:sz="0" w:space="0" w:color="FFFFFF"/>
+            </w:tcBorders>
+            <w:shd w:val="clear" w:color="auto" w:fill="FBF6E9"/>
+            <w:tcMar>
+              <w:top w:w="100" w:type="dxa"/>
+              <w:left w:w="220" w:type="dxa"/>
+              <w:bottom w:w="100" w:type="dxa"/>
+              <w:right w:w="160" w:type="dxa"/>
+            </w:tcMar>
+          </w:tcPr>
+          <w:p>
+            <w:pPr>
+              <w:spacing w:after="40"/>
+            </w:pPr>
+            <w:r>
+              <w:rPr>
+                <w:rFonts w:ascii="Arial" w:eastAsia="Arial" w:hAnsi="Arial" w:cs="Arial"/>
+                <w:b/>
+                <w:bCs/>
+                <w:color w:val="C9A84C"/>
+                <w:spacing w:val="60"/>
+                <w:sz w:val="15"/>
+                <w:szCs w:val="15"/>
+              </w:rPr>
+              <w:t>HOW TO TELL IF IT ACTUALLY WORKED</w:t>
+            </w:r>
+          </w:p>
+          <w:p>
+            <w:r>
+              <w:rPr>
+                <w:rFonts w:ascii="Arial" w:eastAsia="Arial" w:hAnsi="Arial" w:cs="Arial"/>
+                <w:color w:val="2C2C2A"/>
+              </w:rPr>
+              <w:t>After running Extract Insights, scroll to the very bottom of the results panel — there’s a “Graph Engine Status” line. “Injected into Neo4j Ontology” means it worked. “Offline / Bypass active (… Unauthorized …)” means the wrong Neo4j is running — see above.</w:t>
+            </w:r>
+          </w:p>
+        </w:tc>
+      </w:tr>
+    </w:tbl>
+    <w:p>
+      <w:pPr>
+        <w:pBdr>
+          <w:bottom w:val="single" w:sz="4" w:space="0" w:color="DDDDCC"/>
+        </w:pBdr>
+        <w:spacing w:before="320" w:after="80"/>
+      </w:pPr>
+      <w:r>
+        <w:rPr>
+          <w:rFonts w:ascii="Arial" w:eastAsia="Arial" w:hAnsi="Arial" w:cs="Arial"/>
+          <w:b/>
+          <w:bCs/>
+          <w:color w:val="C9A84C"/>
+          <w:spacing w:val="80"/>
+          <w:sz w:val="16"/>
+          <w:szCs w:val="16"/>
+        </w:rPr>
         <w:t>PREREQUISITES — INSTALL THESE FIRST</w:t>
       </w:r>
     </w:p>
@@ -758,17 +1007,8 @@
           <w:rFonts w:ascii="Arial" w:eastAsia="Arial" w:hAnsi="Arial" w:cs="Arial"/>
           <w:color w:val="555550"/>
         </w:rPr>
-        <w:t xml:space="preserve">After install, open Docker Desktop and confirm it shows "Running" in the bottom </w:t>
-      </w:r>
-      <w:proofErr w:type="gramStart"/>
-      <w:r>
-        <w:rPr>
-          <w:rFonts w:ascii="Arial" w:eastAsia="Arial" w:hAnsi="Arial" w:cs="Arial"/>
-          <w:color w:val="555550"/>
-        </w:rPr>
-        <w:t>left</w:t>
-      </w:r>
-      <w:proofErr w:type="gramEnd"/>
+        <w:t>After install, open Docker Desktop and confirm it shows "Running" in the bottom left</w:t>
+      </w:r>
     </w:p>
     <w:p>
       <w:pPr>
@@ -971,25 +1211,7 @@
                 <w:sz w:val="18"/>
                 <w:szCs w:val="18"/>
               </w:rPr>
-              <w:t>$</w:t>
-            </w:r>
-            <w:proofErr w:type="gramStart"/>
-            <w:r>
-              <w:rPr>
-                <w:rFonts w:ascii="Courier New" w:eastAsia="Courier New" w:hAnsi="Courier New" w:cs="Courier New"/>
-                <w:sz w:val="18"/>
-                <w:szCs w:val="18"/>
-              </w:rPr>
-              <w:t>env:OPENAI</w:t>
-            </w:r>
-            <w:proofErr w:type="gramEnd"/>
-            <w:r>
-              <w:rPr>
-                <w:rFonts w:ascii="Courier New" w:eastAsia="Courier New" w:hAnsi="Courier New" w:cs="Courier New"/>
-                <w:sz w:val="18"/>
-                <w:szCs w:val="18"/>
-              </w:rPr>
-              <w:t>_API_KEY="sk-your-key-here"</w:t>
+              <w:t>$env:OPENAI_API_KEY="sk-your-key-here"</w:t>
             </w:r>
           </w:p>
         </w:tc>
@@ -1121,19 +1343,8 @@
           <w:bCs/>
           <w:color w:val="C9A84C"/>
         </w:rPr>
-        <w:t xml:space="preserve">Step 1 — Create virtual </w:t>
-      </w:r>
-      <w:proofErr w:type="gramStart"/>
-      <w:r>
-        <w:rPr>
-          <w:rFonts w:ascii="Arial" w:eastAsia="Arial" w:hAnsi="Arial" w:cs="Arial"/>
-          <w:b/>
-          <w:bCs/>
-          <w:color w:val="C9A84C"/>
-        </w:rPr>
-        <w:t>environment</w:t>
-      </w:r>
-      <w:proofErr w:type="gramEnd"/>
+        <w:t>Step 1 — Create virtual environment</w:t>
+      </w:r>
     </w:p>
     <w:tbl>
       <w:tblPr>
@@ -1274,7 +1485,6 @@
       <w:pPr>
         <w:spacing w:before="40" w:after="40"/>
       </w:pPr>
-      <w:proofErr w:type="gramStart"/>
       <w:r>
         <w:rPr>
           <w:rFonts w:ascii="Arial" w:eastAsia="Arial" w:hAnsi="Arial" w:cs="Arial"/>
@@ -1282,37 +1492,7 @@
           <w:iCs/>
           <w:color w:val="888880"/>
         </w:rPr>
-        <w:t>You'll</w:t>
-      </w:r>
-      <w:proofErr w:type="gramEnd"/>
-      <w:r>
-        <w:rPr>
-          <w:rFonts w:ascii="Arial" w:eastAsia="Arial" w:hAnsi="Arial" w:cs="Arial"/>
-          <w:i/>
-          <w:iCs/>
-          <w:color w:val="888880"/>
-        </w:rPr>
-        <w:t xml:space="preserve"> see (venv) appear in your terminal — that means </w:t>
-      </w:r>
-      <w:proofErr w:type="gramStart"/>
-      <w:r>
-        <w:rPr>
-          <w:rFonts w:ascii="Arial" w:eastAsia="Arial" w:hAnsi="Arial" w:cs="Arial"/>
-          <w:i/>
-          <w:iCs/>
-          <w:color w:val="888880"/>
-        </w:rPr>
-        <w:t>it's</w:t>
-      </w:r>
-      <w:proofErr w:type="gramEnd"/>
-      <w:r>
-        <w:rPr>
-          <w:rFonts w:ascii="Arial" w:eastAsia="Arial" w:hAnsi="Arial" w:cs="Arial"/>
-          <w:i/>
-          <w:iCs/>
-          <w:color w:val="888880"/>
-        </w:rPr>
-        <w:t xml:space="preserve"> active.</w:t>
+        <w:t>You'll see (venv) appear in your terminal — that means it's active.</w:t>
       </w:r>
     </w:p>
     <w:p>
@@ -1326,19 +1506,8 @@
           <w:bCs/>
           <w:color w:val="C9A84C"/>
         </w:rPr>
-        <w:t xml:space="preserve">Step 2 — Install </w:t>
-      </w:r>
-      <w:proofErr w:type="gramStart"/>
-      <w:r>
-        <w:rPr>
-          <w:rFonts w:ascii="Arial" w:eastAsia="Arial" w:hAnsi="Arial" w:cs="Arial"/>
-          <w:b/>
-          <w:bCs/>
-          <w:color w:val="C9A84C"/>
-        </w:rPr>
-        <w:t>dependencies</w:t>
-      </w:r>
-      <w:proofErr w:type="gramEnd"/>
+        <w:t>Step 2 — Install dependencies</w:t>
+      </w:r>
     </w:p>
     <w:tbl>
       <w:tblPr>
@@ -1507,23 +1676,7 @@
           <w:rFonts w:ascii="Arial" w:eastAsia="Arial" w:hAnsi="Arial" w:cs="Arial"/>
           <w:color w:val="2C2C2A"/>
         </w:rPr>
-        <w:t xml:space="preserve">Verify </w:t>
-      </w:r>
-      <w:proofErr w:type="gramStart"/>
-      <w:r>
-        <w:rPr>
-          <w:rFonts w:ascii="Arial" w:eastAsia="Arial" w:hAnsi="Arial" w:cs="Arial"/>
-          <w:color w:val="2C2C2A"/>
-        </w:rPr>
-        <w:t>it's</w:t>
-      </w:r>
-      <w:proofErr w:type="gramEnd"/>
-      <w:r>
-        <w:rPr>
-          <w:rFonts w:ascii="Arial" w:eastAsia="Arial" w:hAnsi="Arial" w:cs="Arial"/>
-          <w:color w:val="2C2C2A"/>
-        </w:rPr>
-        <w:t xml:space="preserve"> running:</w:t>
+        <w:t>Verify it's running:</w:t>
       </w:r>
     </w:p>
     <w:tbl>
@@ -1667,55 +1820,7 @@
                 <w:rFonts w:ascii="Arial" w:eastAsia="Arial" w:hAnsi="Arial" w:cs="Arial"/>
                 <w:color w:val="2C2C2A"/>
               </w:rPr>
-              <w:t xml:space="preserve">Go to </w:t>
-            </w:r>
-            <w:proofErr w:type="gramStart"/>
-            <w:r>
-              <w:rPr>
-                <w:rFonts w:ascii="Arial" w:eastAsia="Arial" w:hAnsi="Arial" w:cs="Arial"/>
-                <w:color w:val="2C2C2A"/>
-              </w:rPr>
-              <w:t>http://localhost:7474  |</w:t>
-            </w:r>
-            <w:proofErr w:type="gramEnd"/>
-            <w:r>
-              <w:rPr>
-                <w:rFonts w:ascii="Arial" w:eastAsia="Arial" w:hAnsi="Arial" w:cs="Arial"/>
-                <w:color w:val="2C2C2A"/>
-              </w:rPr>
-              <w:t xml:space="preserve">  Username: neo4</w:t>
-            </w:r>
-            <w:proofErr w:type="gramStart"/>
-            <w:r>
-              <w:rPr>
-                <w:rFonts w:ascii="Arial" w:eastAsia="Arial" w:hAnsi="Arial" w:cs="Arial"/>
-                <w:color w:val="2C2C2A"/>
-              </w:rPr>
-              <w:t>j  |</w:t>
-            </w:r>
-            <w:proofErr w:type="gramEnd"/>
-            <w:r>
-              <w:rPr>
-                <w:rFonts w:ascii="Arial" w:eastAsia="Arial" w:hAnsi="Arial" w:cs="Arial"/>
-                <w:color w:val="2C2C2A"/>
-              </w:rPr>
-              <w:t xml:space="preserve">  Password: korumlab123 You'll see an empty graph. </w:t>
-            </w:r>
-            <w:proofErr w:type="gramStart"/>
-            <w:r>
-              <w:rPr>
-                <w:rFonts w:ascii="Arial" w:eastAsia="Arial" w:hAnsi="Arial" w:cs="Arial"/>
-                <w:color w:val="2C2C2A"/>
-              </w:rPr>
-              <w:t>That's</w:t>
-            </w:r>
-            <w:proofErr w:type="gramEnd"/>
-            <w:r>
-              <w:rPr>
-                <w:rFonts w:ascii="Arial" w:eastAsia="Arial" w:hAnsi="Arial" w:cs="Arial"/>
-                <w:color w:val="2C2C2A"/>
-              </w:rPr>
-              <w:t xml:space="preserve"> correct — nothing loaded yet.</w:t>
+              <w:t>Go to http://localhost:7474  |  Username: neo4j  |  Password: korumlab123 You'll see an empty graph. That's correct — nothing loaded yet.</w:t>
             </w:r>
           </w:p>
         </w:tc>
@@ -1808,19 +1913,8 @@
                 <w:sz w:val="18"/>
                 <w:szCs w:val="18"/>
               </w:rPr>
-              <w:t>python -m korum_</w:t>
-            </w:r>
-            <w:proofErr w:type="gramStart"/>
-            <w:r>
-              <w:rPr>
-                <w:rFonts w:ascii="Courier New" w:eastAsia="Courier New" w:hAnsi="Courier New" w:cs="Courier New"/>
-                <w:color w:val="FFFFFF" w:themeColor="background1"/>
-                <w:sz w:val="18"/>
-                <w:szCs w:val="18"/>
-              </w:rPr>
-              <w:t>lab.main</w:t>
-            </w:r>
-            <w:proofErr w:type="gramEnd"/>
+              <w:t>python -m korum_lab.main</w:t>
+            </w:r>
           </w:p>
         </w:tc>
       </w:tr>
@@ -1834,23 +1928,7 @@
           <w:rFonts w:ascii="Arial" w:eastAsia="Arial" w:hAnsi="Arial" w:cs="Arial"/>
           <w:color w:val="2C2C2A"/>
         </w:rPr>
-        <w:t xml:space="preserve">Runs all </w:t>
-      </w:r>
-      <w:proofErr w:type="gramStart"/>
-      <w:r>
-        <w:rPr>
-          <w:rFonts w:ascii="Arial" w:eastAsia="Arial" w:hAnsi="Arial" w:cs="Arial"/>
-          <w:color w:val="2C2C2A"/>
-        </w:rPr>
-        <w:t>4</w:t>
-      </w:r>
-      <w:proofErr w:type="gramEnd"/>
-      <w:r>
-        <w:rPr>
-          <w:rFonts w:ascii="Arial" w:eastAsia="Arial" w:hAnsi="Arial" w:cs="Arial"/>
-          <w:color w:val="2C2C2A"/>
-        </w:rPr>
-        <w:t xml:space="preserve"> stages in sequence:</w:t>
+        <w:t>Runs all 4 stages in sequence:</w:t>
       </w:r>
     </w:p>
     <w:p>
@@ -1901,17 +1979,8 @@
           <w:rFonts w:ascii="Arial" w:eastAsia="Arial" w:hAnsi="Arial" w:cs="Arial"/>
           <w:color w:val="2C2C2A"/>
         </w:rPr>
-        <w:t xml:space="preserve">Loads extracted data into </w:t>
-      </w:r>
-      <w:proofErr w:type="gramStart"/>
-      <w:r>
-        <w:rPr>
-          <w:rFonts w:ascii="Arial" w:eastAsia="Arial" w:hAnsi="Arial" w:cs="Arial"/>
-          <w:color w:val="2C2C2A"/>
-        </w:rPr>
-        <w:t>Neo4j</w:t>
-      </w:r>
-      <w:proofErr w:type="gramEnd"/>
+        <w:t>Loads extracted data into Neo4j</w:t>
+      </w:r>
     </w:p>
     <w:p>
       <w:pPr>
@@ -1922,47 +1991,13 @@
         </w:numPr>
         <w:spacing w:before="40" w:after="40"/>
       </w:pPr>
-      <w:proofErr w:type="gramStart"/>
       <w:r>
         <w:rPr>
           <w:rFonts w:ascii="Arial" w:eastAsia="Arial" w:hAnsi="Arial" w:cs="Arial"/>
           <w:color w:val="2C2C2A"/>
         </w:rPr>
-        <w:t>Queries</w:t>
-      </w:r>
-      <w:proofErr w:type="gramEnd"/>
-      <w:r>
-        <w:rPr>
-          <w:rFonts w:ascii="Arial" w:eastAsia="Arial" w:hAnsi="Arial" w:cs="Arial"/>
-          <w:color w:val="2C2C2A"/>
-        </w:rPr>
-        <w:t xml:space="preserve"> the graph and </w:t>
-      </w:r>
-      <w:proofErr w:type="gramStart"/>
-      <w:r>
-        <w:rPr>
-          <w:rFonts w:ascii="Arial" w:eastAsia="Arial" w:hAnsi="Arial" w:cs="Arial"/>
-          <w:color w:val="2C2C2A"/>
-        </w:rPr>
-        <w:t>prints</w:t>
-      </w:r>
-      <w:proofErr w:type="gramEnd"/>
-      <w:r>
-        <w:rPr>
-          <w:rFonts w:ascii="Arial" w:eastAsia="Arial" w:hAnsi="Arial" w:cs="Arial"/>
-          <w:color w:val="2C2C2A"/>
-        </w:rPr>
-        <w:t xml:space="preserve"> </w:t>
-      </w:r>
-      <w:proofErr w:type="gramStart"/>
-      <w:r>
-        <w:rPr>
-          <w:rFonts w:ascii="Arial" w:eastAsia="Arial" w:hAnsi="Arial" w:cs="Arial"/>
-          <w:color w:val="2C2C2A"/>
-        </w:rPr>
-        <w:t>results</w:t>
-      </w:r>
-      <w:proofErr w:type="gramEnd"/>
+        <w:t>Queries the graph and prints results</w:t>
+      </w:r>
     </w:p>
     <w:p>
       <w:pPr>
@@ -2133,21 +2168,12 @@
       <w:pPr>
         <w:spacing w:before="40" w:after="40"/>
       </w:pPr>
-      <w:proofErr w:type="gramStart"/>
       <w:r>
         <w:rPr>
           <w:rFonts w:ascii="Arial" w:eastAsia="Arial" w:hAnsi="Arial" w:cs="Arial"/>
           <w:color w:val="888880"/>
         </w:rPr>
-        <w:t>Tests</w:t>
-      </w:r>
-      <w:proofErr w:type="gramEnd"/>
-      <w:r>
-        <w:rPr>
-          <w:rFonts w:ascii="Arial" w:eastAsia="Arial" w:hAnsi="Arial" w:cs="Arial"/>
-          <w:color w:val="888880"/>
-        </w:rPr>
-        <w:t xml:space="preserve"> your OpenAI key and structured extraction. Prints JSON to terminal.</w:t>
+        <w:t>Tests your OpenAI key and structured extraction. Prints JSON to terminal.</w:t>
       </w:r>
     </w:p>
     <w:p>
@@ -2230,39 +2256,7 @@
           <w:rFonts w:ascii="Arial" w:eastAsia="Arial" w:hAnsi="Arial" w:cs="Arial"/>
           <w:color w:val="888880"/>
         </w:rPr>
-        <w:t xml:space="preserve">Ingests </w:t>
-      </w:r>
-      <w:proofErr w:type="gramStart"/>
-      <w:r>
-        <w:rPr>
-          <w:rFonts w:ascii="Arial" w:eastAsia="Arial" w:hAnsi="Arial" w:cs="Arial"/>
-          <w:color w:val="888880"/>
-        </w:rPr>
-        <w:t>3</w:t>
-      </w:r>
-      <w:proofErr w:type="gramEnd"/>
-      <w:r>
-        <w:rPr>
-          <w:rFonts w:ascii="Arial" w:eastAsia="Arial" w:hAnsi="Arial" w:cs="Arial"/>
-          <w:color w:val="888880"/>
-        </w:rPr>
-        <w:t xml:space="preserve"> sample docs into ChromaDB, runs </w:t>
-      </w:r>
-      <w:proofErr w:type="gramStart"/>
-      <w:r>
-        <w:rPr>
-          <w:rFonts w:ascii="Arial" w:eastAsia="Arial" w:hAnsi="Arial" w:cs="Arial"/>
-          <w:color w:val="888880"/>
-        </w:rPr>
-        <w:t>2</w:t>
-      </w:r>
-      <w:proofErr w:type="gramEnd"/>
-      <w:r>
-        <w:rPr>
-          <w:rFonts w:ascii="Arial" w:eastAsia="Arial" w:hAnsi="Arial" w:cs="Arial"/>
-          <w:color w:val="888880"/>
-        </w:rPr>
-        <w:t xml:space="preserve"> semantic searches. Creates chroma_db/ folder in project directory.</w:t>
+        <w:t>Ingests 3 sample docs into ChromaDB, runs 2 semantic searches. Creates chroma_db/ folder in project directory.</w:t>
       </w:r>
     </w:p>
     <w:p>
@@ -2409,21 +2403,12 @@
       <w:pPr>
         <w:spacing w:before="40" w:after="40"/>
       </w:pPr>
-      <w:proofErr w:type="gramStart"/>
       <w:r>
         <w:rPr>
           <w:rFonts w:ascii="Arial" w:eastAsia="Arial" w:hAnsi="Arial" w:cs="Arial"/>
           <w:color w:val="888880"/>
         </w:rPr>
-        <w:t>You'll</w:t>
-      </w:r>
-      <w:proofErr w:type="gramEnd"/>
-      <w:r>
-        <w:rPr>
-          <w:rFonts w:ascii="Arial" w:eastAsia="Arial" w:hAnsi="Arial" w:cs="Arial"/>
-          <w:color w:val="888880"/>
-        </w:rPr>
-        <w:t xml:space="preserve"> see your nodes and relationships as a visual graph.</w:t>
+        <w:t>You'll see your nodes and relationships as a visual graph.</w:t>
       </w:r>
     </w:p>
     <w:p>
@@ -2782,47 +2767,7 @@
                 <w:sz w:val="18"/>
                 <w:szCs w:val="18"/>
               </w:rPr>
-              <w:t xml:space="preserve">                    [Evidence:       </w:t>
-            </w:r>
-            <w:proofErr w:type="gramStart"/>
-            <w:r>
-              <w:rPr>
-                <w:rFonts w:ascii="Courier New" w:eastAsia="Courier New" w:hAnsi="Courier New" w:cs="Courier New"/>
-                <w:color w:val="FFFFFF" w:themeColor="background1"/>
-                <w:sz w:val="18"/>
-                <w:szCs w:val="18"/>
-              </w:rPr>
-              <w:t xml:space="preserve">   [</w:t>
-            </w:r>
-            <w:proofErr w:type="gramEnd"/>
-            <w:r>
-              <w:rPr>
-                <w:rFonts w:ascii="Courier New" w:eastAsia="Courier New" w:hAnsi="Courier New" w:cs="Courier New"/>
-                <w:color w:val="FFFFFF" w:themeColor="background1"/>
-                <w:sz w:val="18"/>
-                <w:szCs w:val="18"/>
-              </w:rPr>
-              <w:t xml:space="preserve">Assumption:       </w:t>
-            </w:r>
-            <w:proofErr w:type="gramStart"/>
-            <w:r>
-              <w:rPr>
-                <w:rFonts w:ascii="Courier New" w:eastAsia="Courier New" w:hAnsi="Courier New" w:cs="Courier New"/>
-                <w:color w:val="FFFFFF" w:themeColor="background1"/>
-                <w:sz w:val="18"/>
-                <w:szCs w:val="18"/>
-              </w:rPr>
-              <w:t xml:space="preserve">   [</w:t>
-            </w:r>
-            <w:proofErr w:type="gramEnd"/>
-            <w:r>
-              <w:rPr>
-                <w:rFonts w:ascii="Courier New" w:eastAsia="Courier New" w:hAnsi="Courier New" w:cs="Courier New"/>
-                <w:color w:val="FFFFFF" w:themeColor="background1"/>
-                <w:sz w:val="18"/>
-                <w:szCs w:val="18"/>
-              </w:rPr>
-              <w:t>Unknown:</w:t>
+              <w:t xml:space="preserve">                    [Evidence:          [Assumption:          [Unknown:</w:t>
             </w:r>
           </w:p>
         </w:tc>
@@ -2859,47 +2804,7 @@
                 <w:sz w:val="18"/>
                 <w:szCs w:val="18"/>
               </w:rPr>
-              <w:t xml:space="preserve">                    Timeout </w:t>
-            </w:r>
-            <w:proofErr w:type="gramStart"/>
-            <w:r>
-              <w:rPr>
-                <w:rFonts w:ascii="Courier New" w:eastAsia="Courier New" w:hAnsi="Courier New" w:cs="Courier New"/>
-                <w:color w:val="FFFFFF" w:themeColor="background1"/>
-                <w:sz w:val="18"/>
-                <w:szCs w:val="18"/>
-              </w:rPr>
-              <w:t xml:space="preserve">errors]   </w:t>
-            </w:r>
-            <w:proofErr w:type="gramEnd"/>
-            <w:r>
-              <w:rPr>
-                <w:rFonts w:ascii="Courier New" w:eastAsia="Courier New" w:hAnsi="Courier New" w:cs="Courier New"/>
-                <w:color w:val="FFFFFF" w:themeColor="background1"/>
-                <w:sz w:val="18"/>
-                <w:szCs w:val="18"/>
-              </w:rPr>
-              <w:t xml:space="preserve">   Patch </w:t>
-            </w:r>
-            <w:proofErr w:type="gramStart"/>
-            <w:r>
-              <w:rPr>
-                <w:rFonts w:ascii="Courier New" w:eastAsia="Courier New" w:hAnsi="Courier New" w:cs="Courier New"/>
-                <w:color w:val="FFFFFF" w:themeColor="background1"/>
-                <w:sz w:val="18"/>
-                <w:szCs w:val="18"/>
-              </w:rPr>
-              <w:t xml:space="preserve">Fri]   </w:t>
-            </w:r>
-            <w:proofErr w:type="gramEnd"/>
-            <w:r>
-              <w:rPr>
-                <w:rFonts w:ascii="Courier New" w:eastAsia="Courier New" w:hAnsi="Courier New" w:cs="Courier New"/>
-                <w:color w:val="FFFFFF" w:themeColor="background1"/>
-                <w:sz w:val="18"/>
-                <w:szCs w:val="18"/>
-              </w:rPr>
-              <w:t xml:space="preserve">        Covers cluster?]</w:t>
+              <w:t xml:space="preserve">                    Timeout errors]      Patch Fri]           Covers cluster?]</w:t>
             </w:r>
           </w:p>
         </w:tc>
@@ -2995,47 +2900,7 @@
           <w:iCs/>
           <w:color w:val="2C2C2A"/>
         </w:rPr>
-        <w:t xml:space="preserve">This is the "defensible decisions" </w:t>
-      </w:r>
-      <w:proofErr w:type="gramStart"/>
-      <w:r>
-        <w:rPr>
-          <w:rFonts w:ascii="Arial" w:eastAsia="Arial" w:hAnsi="Arial" w:cs="Arial"/>
-          <w:i/>
-          <w:iCs/>
-          <w:color w:val="2C2C2A"/>
-        </w:rPr>
-        <w:t>principle — walk</w:t>
-      </w:r>
-      <w:proofErr w:type="gramEnd"/>
-      <w:r>
-        <w:rPr>
-          <w:rFonts w:ascii="Arial" w:eastAsia="Arial" w:hAnsi="Arial" w:cs="Arial"/>
-          <w:i/>
-          <w:iCs/>
-          <w:color w:val="2C2C2A"/>
-        </w:rPr>
-        <w:t xml:space="preserve"> backwards from any decision and </w:t>
-      </w:r>
-      <w:proofErr w:type="gramStart"/>
-      <w:r>
-        <w:rPr>
-          <w:rFonts w:ascii="Arial" w:eastAsia="Arial" w:hAnsi="Arial" w:cs="Arial"/>
-          <w:i/>
-          <w:iCs/>
-          <w:color w:val="2C2C2A"/>
-        </w:rPr>
-        <w:t>see</w:t>
-      </w:r>
-      <w:proofErr w:type="gramEnd"/>
-      <w:r>
-        <w:rPr>
-          <w:rFonts w:ascii="Arial" w:eastAsia="Arial" w:hAnsi="Arial" w:cs="Arial"/>
-          <w:i/>
-          <w:iCs/>
-          <w:color w:val="2C2C2A"/>
-        </w:rPr>
-        <w:t xml:space="preserve"> exactly what evidence supported it, what assumptions it depended on, and what was unknown at the time.</w:t>
+        <w:t>This is the "defensible decisions" principle — walk backwards from any decision and see exactly what evidence supported it, what assumptions it depended on, and what was unknown at the time.</w:t>
       </w:r>
     </w:p>
     <w:p>
@@ -3063,39 +2928,7 @@
           <w:rFonts w:ascii="Arial" w:eastAsia="Arial" w:hAnsi="Arial" w:cs="Arial"/>
           <w:color w:val="2C2C2A"/>
         </w:rPr>
-        <w:t xml:space="preserve">The schema in korum_lab/models/extraction.py defines what the LLM is allowed to extract. If </w:t>
-      </w:r>
-      <w:proofErr w:type="gramStart"/>
-      <w:r>
-        <w:rPr>
-          <w:rFonts w:ascii="Arial" w:eastAsia="Arial" w:hAnsi="Arial" w:cs="Arial"/>
-          <w:color w:val="2C2C2A"/>
-        </w:rPr>
-        <w:t>it's</w:t>
-      </w:r>
-      <w:proofErr w:type="gramEnd"/>
-      <w:r>
-        <w:rPr>
-          <w:rFonts w:ascii="Arial" w:eastAsia="Arial" w:hAnsi="Arial" w:cs="Arial"/>
-          <w:color w:val="2C2C2A"/>
-        </w:rPr>
-        <w:t xml:space="preserve"> not in the schema, it </w:t>
-      </w:r>
-      <w:proofErr w:type="gramStart"/>
-      <w:r>
-        <w:rPr>
-          <w:rFonts w:ascii="Arial" w:eastAsia="Arial" w:hAnsi="Arial" w:cs="Arial"/>
-          <w:color w:val="2C2C2A"/>
-        </w:rPr>
-        <w:t>can't</w:t>
-      </w:r>
-      <w:proofErr w:type="gramEnd"/>
-      <w:r>
-        <w:rPr>
-          <w:rFonts w:ascii="Arial" w:eastAsia="Arial" w:hAnsi="Arial" w:cs="Arial"/>
-          <w:color w:val="2C2C2A"/>
-        </w:rPr>
-        <w:t xml:space="preserve"> enter the graph.</w:t>
+        <w:t>The schema in korum_lab/models/extraction.py defines what the LLM is allowed to extract. If it's not in the schema, it can't enter the graph.</w:t>
       </w:r>
     </w:p>
     <w:p>
@@ -3157,56 +2990,7 @@
                 <w:sz w:val="18"/>
                 <w:szCs w:val="18"/>
               </w:rPr>
-              <w:t xml:space="preserve">class </w:t>
-            </w:r>
-            <w:r>
-              <w:rPr>
-                <w:rFonts w:ascii="Courier New" w:eastAsia="Courier New" w:hAnsi="Courier New" w:cs="Courier New"/>
-                <w:color w:val="FFFFFF" w:themeColor="background1"/>
-                <w:sz w:val="18"/>
-                <w:szCs w:val="18"/>
-              </w:rPr>
-              <w:t xml:space="preserve">Extracted </w:t>
-            </w:r>
-            <w:proofErr w:type="gramStart"/>
-            <w:r>
-              <w:rPr>
-                <w:rFonts w:ascii="Courier New" w:eastAsia="Courier New" w:hAnsi="Courier New" w:cs="Courier New"/>
-                <w:color w:val="FFFFFF" w:themeColor="background1"/>
-                <w:sz w:val="18"/>
-                <w:szCs w:val="18"/>
-              </w:rPr>
-              <w:t>Decision</w:t>
-            </w:r>
-            <w:r>
-              <w:rPr>
-                <w:rFonts w:ascii="Courier New" w:eastAsia="Courier New" w:hAnsi="Courier New" w:cs="Courier New"/>
-                <w:color w:val="FFFFFF" w:themeColor="background1"/>
-                <w:sz w:val="18"/>
-                <w:szCs w:val="18"/>
-              </w:rPr>
-              <w:t>(</w:t>
-            </w:r>
-            <w:proofErr w:type="spellStart"/>
-            <w:proofErr w:type="gramEnd"/>
-            <w:r>
-              <w:rPr>
-                <w:rFonts w:ascii="Courier New" w:eastAsia="Courier New" w:hAnsi="Courier New" w:cs="Courier New"/>
-                <w:color w:val="FFFFFF" w:themeColor="background1"/>
-                <w:sz w:val="18"/>
-                <w:szCs w:val="18"/>
-              </w:rPr>
-              <w:t>BaseModel</w:t>
-            </w:r>
-            <w:proofErr w:type="spellEnd"/>
-            <w:r>
-              <w:rPr>
-                <w:rFonts w:ascii="Courier New" w:eastAsia="Courier New" w:hAnsi="Courier New" w:cs="Courier New"/>
-                <w:color w:val="FFFFFF" w:themeColor="background1"/>
-                <w:sz w:val="18"/>
-                <w:szCs w:val="18"/>
-              </w:rPr>
-              <w:t>):</w:t>
+              <w:t>class Extracted Decision(BaseModel):</w:t>
             </w:r>
           </w:p>
         </w:tc>
@@ -3280,27 +3064,7 @@
                 <w:sz w:val="18"/>
                 <w:szCs w:val="18"/>
               </w:rPr>
-              <w:t xml:space="preserve">    </w:t>
-            </w:r>
-            <w:proofErr w:type="spellStart"/>
-            <w:r>
-              <w:rPr>
-                <w:rFonts w:ascii="Courier New" w:eastAsia="Courier New" w:hAnsi="Courier New" w:cs="Courier New"/>
-                <w:color w:val="FFFFFF" w:themeColor="background1"/>
-                <w:sz w:val="18"/>
-                <w:szCs w:val="18"/>
-              </w:rPr>
-              <w:t>decision_context</w:t>
-            </w:r>
-            <w:proofErr w:type="spellEnd"/>
-            <w:r>
-              <w:rPr>
-                <w:rFonts w:ascii="Courier New" w:eastAsia="Courier New" w:hAnsi="Courier New" w:cs="Courier New"/>
-                <w:color w:val="FFFFFF" w:themeColor="background1"/>
-                <w:sz w:val="18"/>
-                <w:szCs w:val="18"/>
-              </w:rPr>
-              <w:t>: str # The core decision being faced</w:t>
+              <w:t xml:space="preserve">    decision_context: str # The core decision being faced</w:t>
             </w:r>
           </w:p>
         </w:tc>
@@ -3337,27 +3101,7 @@
                 <w:sz w:val="18"/>
                 <w:szCs w:val="18"/>
               </w:rPr>
-              <w:t xml:space="preserve">    evidence: List[</w:t>
-            </w:r>
-            <w:proofErr w:type="gramStart"/>
-            <w:r>
-              <w:rPr>
-                <w:rFonts w:ascii="Courier New" w:eastAsia="Courier New" w:hAnsi="Courier New" w:cs="Courier New"/>
-                <w:color w:val="FFFFFF" w:themeColor="background1"/>
-                <w:sz w:val="18"/>
-                <w:szCs w:val="18"/>
-              </w:rPr>
-              <w:t xml:space="preserve">str]   </w:t>
-            </w:r>
-            <w:proofErr w:type="gramEnd"/>
-            <w:r>
-              <w:rPr>
-                <w:rFonts w:ascii="Courier New" w:eastAsia="Courier New" w:hAnsi="Courier New" w:cs="Courier New"/>
-                <w:color w:val="FFFFFF" w:themeColor="background1"/>
-                <w:sz w:val="18"/>
-                <w:szCs w:val="18"/>
-              </w:rPr>
-              <w:t># Hard facts — things proven</w:t>
+              <w:t xml:space="preserve">    evidence: List[str]   # Hard facts — things proven</w:t>
             </w:r>
           </w:p>
         </w:tc>
@@ -3431,27 +3175,7 @@
                 <w:sz w:val="18"/>
                 <w:szCs w:val="18"/>
               </w:rPr>
-              <w:t xml:space="preserve">    unknowns: List[</w:t>
-            </w:r>
-            <w:proofErr w:type="gramStart"/>
-            <w:r>
-              <w:rPr>
-                <w:rFonts w:ascii="Courier New" w:eastAsia="Courier New" w:hAnsi="Courier New" w:cs="Courier New"/>
-                <w:color w:val="FFFFFF" w:themeColor="background1"/>
-                <w:sz w:val="18"/>
-                <w:szCs w:val="18"/>
-              </w:rPr>
-              <w:t xml:space="preserve">str]   </w:t>
-            </w:r>
-            <w:proofErr w:type="gramEnd"/>
-            <w:r>
-              <w:rPr>
-                <w:rFonts w:ascii="Courier New" w:eastAsia="Courier New" w:hAnsi="Courier New" w:cs="Courier New"/>
-                <w:color w:val="FFFFFF" w:themeColor="background1"/>
-                <w:sz w:val="18"/>
-                <w:szCs w:val="18"/>
-              </w:rPr>
-              <w:t># Critical missing information</w:t>
+              <w:t xml:space="preserve">    unknowns: List[str]   # Critical missing information</w:t>
             </w:r>
           </w:p>
         </w:tc>
@@ -3488,27 +3212,7 @@
                 <w:sz w:val="18"/>
                 <w:szCs w:val="18"/>
               </w:rPr>
-              <w:t xml:space="preserve">    risks: List[</w:t>
-            </w:r>
-            <w:proofErr w:type="gramStart"/>
-            <w:r>
-              <w:rPr>
-                <w:rFonts w:ascii="Courier New" w:eastAsia="Courier New" w:hAnsi="Courier New" w:cs="Courier New"/>
-                <w:color w:val="FFFFFF" w:themeColor="background1"/>
-                <w:sz w:val="18"/>
-                <w:szCs w:val="18"/>
-              </w:rPr>
-              <w:t xml:space="preserve">str]   </w:t>
-            </w:r>
-            <w:proofErr w:type="gramEnd"/>
-            <w:r>
-              <w:rPr>
-                <w:rFonts w:ascii="Courier New" w:eastAsia="Courier New" w:hAnsi="Courier New" w:cs="Courier New"/>
-                <w:color w:val="FFFFFF" w:themeColor="background1"/>
-                <w:sz w:val="18"/>
-                <w:szCs w:val="18"/>
-              </w:rPr>
-              <w:t xml:space="preserve">   # What could go wrong</w:t>
+              <w:t xml:space="preserve">    risks: List[str]      # What could go wrong</w:t>
             </w:r>
           </w:p>
         </w:tc>
@@ -3599,19 +3303,8 @@
           <w:bCs/>
           <w:color w:val="C9A84C"/>
         </w:rPr>
-        <w:t xml:space="preserve">See </w:t>
-      </w:r>
-      <w:proofErr w:type="gramStart"/>
-      <w:r>
-        <w:rPr>
-          <w:rFonts w:ascii="Arial" w:eastAsia="Arial" w:hAnsi="Arial" w:cs="Arial"/>
-          <w:b/>
-          <w:bCs/>
-          <w:color w:val="C9A84C"/>
-        </w:rPr>
-        <w:t>everything</w:t>
-      </w:r>
-      <w:proofErr w:type="gramEnd"/>
+        <w:t>See everything</w:t>
+      </w:r>
     </w:p>
     <w:tbl>
       <w:tblPr>
@@ -3681,19 +3374,8 @@
           <w:bCs/>
           <w:color w:val="C9A84C"/>
         </w:rPr>
-        <w:t xml:space="preserve">Find all risks for a </w:t>
-      </w:r>
-      <w:proofErr w:type="gramStart"/>
-      <w:r>
-        <w:rPr>
-          <w:rFonts w:ascii="Arial" w:eastAsia="Arial" w:hAnsi="Arial" w:cs="Arial"/>
-          <w:b/>
-          <w:bCs/>
-          <w:color w:val="C9A84C"/>
-        </w:rPr>
-        <w:t>project</w:t>
-      </w:r>
-      <w:proofErr w:type="gramEnd"/>
+        <w:t>Find all risks for a project</w:t>
+      </w:r>
     </w:p>
     <w:tbl>
       <w:tblPr>
@@ -3749,91 +3431,7 @@
                 <w:sz w:val="18"/>
                 <w:szCs w:val="18"/>
               </w:rPr>
-              <w:t>MATCH (</w:t>
-            </w:r>
-            <w:proofErr w:type="spellStart"/>
-            <w:proofErr w:type="gramStart"/>
-            <w:r>
-              <w:rPr>
-                <w:rFonts w:ascii="Courier New" w:eastAsia="Courier New" w:hAnsi="Courier New" w:cs="Courier New"/>
-                <w:color w:val="FFFFFF" w:themeColor="background1"/>
-                <w:sz w:val="18"/>
-                <w:szCs w:val="18"/>
-              </w:rPr>
-              <w:t>p:Project</w:t>
-            </w:r>
-            <w:proofErr w:type="spellEnd"/>
-            <w:proofErr w:type="gramEnd"/>
-            <w:r>
-              <w:rPr>
-                <w:rFonts w:ascii="Courier New" w:eastAsia="Courier New" w:hAnsi="Courier New" w:cs="Courier New"/>
-                <w:color w:val="FFFFFF" w:themeColor="background1"/>
-                <w:sz w:val="18"/>
-                <w:szCs w:val="18"/>
-              </w:rPr>
-              <w:t xml:space="preserve"> {name: 'Project Apollo'</w:t>
-            </w:r>
-            <w:proofErr w:type="gramStart"/>
-            <w:r>
-              <w:rPr>
-                <w:rFonts w:ascii="Courier New" w:eastAsia="Courier New" w:hAnsi="Courier New" w:cs="Courier New"/>
-                <w:color w:val="FFFFFF" w:themeColor="background1"/>
-                <w:sz w:val="18"/>
-                <w:szCs w:val="18"/>
-              </w:rPr>
-              <w:t>})&lt;</w:t>
-            </w:r>
-            <w:proofErr w:type="gramEnd"/>
-            <w:r>
-              <w:rPr>
-                <w:rFonts w:ascii="Courier New" w:eastAsia="Courier New" w:hAnsi="Courier New" w:cs="Courier New"/>
-                <w:color w:val="FFFFFF" w:themeColor="background1"/>
-                <w:sz w:val="18"/>
-                <w:szCs w:val="18"/>
-              </w:rPr>
-              <w:t>-</w:t>
-            </w:r>
-            <w:proofErr w:type="gramStart"/>
-            <w:r>
-              <w:rPr>
-                <w:rFonts w:ascii="Courier New" w:eastAsia="Courier New" w:hAnsi="Courier New" w:cs="Courier New"/>
-                <w:color w:val="FFFFFF" w:themeColor="background1"/>
-                <w:sz w:val="18"/>
-                <w:szCs w:val="18"/>
-              </w:rPr>
-              <w:t>[:AFFECTS</w:t>
-            </w:r>
-            <w:proofErr w:type="gramEnd"/>
-            <w:r>
-              <w:rPr>
-                <w:rFonts w:ascii="Courier New" w:eastAsia="Courier New" w:hAnsi="Courier New" w:cs="Courier New"/>
-                <w:color w:val="FFFFFF" w:themeColor="background1"/>
-                <w:sz w:val="18"/>
-                <w:szCs w:val="18"/>
-              </w:rPr>
-              <w:t>]-(</w:t>
-            </w:r>
-            <w:proofErr w:type="spellStart"/>
-            <w:proofErr w:type="gramStart"/>
-            <w:r>
-              <w:rPr>
-                <w:rFonts w:ascii="Courier New" w:eastAsia="Courier New" w:hAnsi="Courier New" w:cs="Courier New"/>
-                <w:color w:val="FFFFFF" w:themeColor="background1"/>
-                <w:sz w:val="18"/>
-                <w:szCs w:val="18"/>
-              </w:rPr>
-              <w:t>r:Risk</w:t>
-            </w:r>
-            <w:proofErr w:type="spellEnd"/>
-            <w:proofErr w:type="gramEnd"/>
-            <w:r>
-              <w:rPr>
-                <w:rFonts w:ascii="Courier New" w:eastAsia="Courier New" w:hAnsi="Courier New" w:cs="Courier New"/>
-                <w:color w:val="FFFFFF" w:themeColor="background1"/>
-                <w:sz w:val="18"/>
-                <w:szCs w:val="18"/>
-              </w:rPr>
-              <w:t>)</w:t>
+              <w:t>MATCH (p:Project {name: 'Project Apollo'})&lt;-[:AFFECTS]-(r:Risk)</w:t>
             </w:r>
           </w:p>
         </w:tc>
@@ -3870,21 +3468,8 @@
                 <w:sz w:val="18"/>
                 <w:szCs w:val="18"/>
               </w:rPr>
-              <w:t xml:space="preserve">RETURN p.name, </w:t>
-            </w:r>
-            <w:proofErr w:type="spellStart"/>
-            <w:proofErr w:type="gramStart"/>
-            <w:r>
-              <w:rPr>
-                <w:rFonts w:ascii="Courier New" w:eastAsia="Courier New" w:hAnsi="Courier New" w:cs="Courier New"/>
-                <w:color w:val="FFFFFF" w:themeColor="background1"/>
-                <w:sz w:val="18"/>
-                <w:szCs w:val="18"/>
-              </w:rPr>
-              <w:t>r.detail</w:t>
-            </w:r>
-            <w:proofErr w:type="spellEnd"/>
-            <w:proofErr w:type="gramEnd"/>
+              <w:t>RETURN p.name, r.detail</w:t>
+            </w:r>
           </w:p>
         </w:tc>
       </w:tr>
@@ -3900,19 +3485,8 @@
           <w:bCs/>
           <w:color w:val="C9A84C"/>
         </w:rPr>
-        <w:t xml:space="preserve">Reconstruct the decision </w:t>
-      </w:r>
-      <w:proofErr w:type="gramStart"/>
-      <w:r>
-        <w:rPr>
-          <w:rFonts w:ascii="Arial" w:eastAsia="Arial" w:hAnsi="Arial" w:cs="Arial"/>
-          <w:b/>
-          <w:bCs/>
-          <w:color w:val="C9A84C"/>
-        </w:rPr>
-        <w:t>foundation</w:t>
-      </w:r>
-      <w:proofErr w:type="gramEnd"/>
+        <w:t>Reconstruct the decision foundation</w:t>
+      </w:r>
     </w:p>
     <w:tbl>
       <w:tblPr>
@@ -3968,71 +3542,7 @@
                 <w:sz w:val="18"/>
                 <w:szCs w:val="18"/>
               </w:rPr>
-              <w:t>MATCH (</w:t>
-            </w:r>
-            <w:proofErr w:type="spellStart"/>
-            <w:proofErr w:type="gramStart"/>
-            <w:r>
-              <w:rPr>
-                <w:rFonts w:ascii="Courier New" w:eastAsia="Courier New" w:hAnsi="Courier New" w:cs="Courier New"/>
-                <w:color w:val="FFFFFF" w:themeColor="background1"/>
-                <w:sz w:val="18"/>
-                <w:szCs w:val="18"/>
-              </w:rPr>
-              <w:t>p:Project</w:t>
-            </w:r>
-            <w:proofErr w:type="spellEnd"/>
-            <w:proofErr w:type="gramEnd"/>
-            <w:r>
-              <w:rPr>
-                <w:rFonts w:ascii="Courier New" w:eastAsia="Courier New" w:hAnsi="Courier New" w:cs="Courier New"/>
-                <w:color w:val="FFFFFF" w:themeColor="background1"/>
-                <w:sz w:val="18"/>
-                <w:szCs w:val="18"/>
-              </w:rPr>
-              <w:t>)-</w:t>
-            </w:r>
-            <w:proofErr w:type="gramStart"/>
-            <w:r>
-              <w:rPr>
-                <w:rFonts w:ascii="Courier New" w:eastAsia="Courier New" w:hAnsi="Courier New" w:cs="Courier New"/>
-                <w:color w:val="FFFFFF" w:themeColor="background1"/>
-                <w:sz w:val="18"/>
-                <w:szCs w:val="18"/>
-              </w:rPr>
-              <w:t>[:REQUIRES</w:t>
-            </w:r>
-            <w:proofErr w:type="gramEnd"/>
-            <w:r>
-              <w:rPr>
-                <w:rFonts w:ascii="Courier New" w:eastAsia="Courier New" w:hAnsi="Courier New" w:cs="Courier New"/>
-                <w:color w:val="FFFFFF" w:themeColor="background1"/>
-                <w:sz w:val="18"/>
-                <w:szCs w:val="18"/>
-              </w:rPr>
-              <w:t>_DECISION]-&gt;(</w:t>
-            </w:r>
-            <w:proofErr w:type="spellStart"/>
-            <w:proofErr w:type="gramStart"/>
-            <w:r>
-              <w:rPr>
-                <w:rFonts w:ascii="Courier New" w:eastAsia="Courier New" w:hAnsi="Courier New" w:cs="Courier New"/>
-                <w:color w:val="FFFFFF" w:themeColor="background1"/>
-                <w:sz w:val="18"/>
-                <w:szCs w:val="18"/>
-              </w:rPr>
-              <w:t>d:Decision</w:t>
-            </w:r>
-            <w:proofErr w:type="spellEnd"/>
-            <w:proofErr w:type="gramEnd"/>
-            <w:r>
-              <w:rPr>
-                <w:rFonts w:ascii="Courier New" w:eastAsia="Courier New" w:hAnsi="Courier New" w:cs="Courier New"/>
-                <w:color w:val="FFFFFF" w:themeColor="background1"/>
-                <w:sz w:val="18"/>
-                <w:szCs w:val="18"/>
-              </w:rPr>
-              <w:t>)</w:t>
+              <w:t>MATCH (p:Project)-[:REQUIRES_DECISION]-&gt;(d:Decision)</w:t>
             </w:r>
           </w:p>
         </w:tc>
@@ -4069,49 +3579,7 @@
                 <w:sz w:val="18"/>
                 <w:szCs w:val="18"/>
               </w:rPr>
-              <w:t>OPTIONAL MATCH (d)-</w:t>
-            </w:r>
-            <w:proofErr w:type="gramStart"/>
-            <w:r>
-              <w:rPr>
-                <w:rFonts w:ascii="Courier New" w:eastAsia="Courier New" w:hAnsi="Courier New" w:cs="Courier New"/>
-                <w:color w:val="FFFFFF" w:themeColor="background1"/>
-                <w:sz w:val="18"/>
-                <w:szCs w:val="18"/>
-              </w:rPr>
-              <w:t>[:SUPPORTED</w:t>
-            </w:r>
-            <w:proofErr w:type="gramEnd"/>
-            <w:r>
-              <w:rPr>
-                <w:rFonts w:ascii="Courier New" w:eastAsia="Courier New" w:hAnsi="Courier New" w:cs="Courier New"/>
-                <w:color w:val="FFFFFF" w:themeColor="background1"/>
-                <w:sz w:val="18"/>
-                <w:szCs w:val="18"/>
-              </w:rPr>
-              <w:t>_BY]-&gt;(</w:t>
-            </w:r>
-            <w:proofErr w:type="spellStart"/>
-            <w:proofErr w:type="gramStart"/>
-            <w:r>
-              <w:rPr>
-                <w:rFonts w:ascii="Courier New" w:eastAsia="Courier New" w:hAnsi="Courier New" w:cs="Courier New"/>
-                <w:color w:val="FFFFFF" w:themeColor="background1"/>
-                <w:sz w:val="18"/>
-                <w:szCs w:val="18"/>
-              </w:rPr>
-              <w:t>e:Evidence</w:t>
-            </w:r>
-            <w:proofErr w:type="spellEnd"/>
-            <w:proofErr w:type="gramEnd"/>
-            <w:r>
-              <w:rPr>
-                <w:rFonts w:ascii="Courier New" w:eastAsia="Courier New" w:hAnsi="Courier New" w:cs="Courier New"/>
-                <w:color w:val="FFFFFF" w:themeColor="background1"/>
-                <w:sz w:val="18"/>
-                <w:szCs w:val="18"/>
-              </w:rPr>
-              <w:t>)</w:t>
+              <w:t>OPTIONAL MATCH (d)-[:SUPPORTED_BY]-&gt;(e:Evidence)</w:t>
             </w:r>
           </w:p>
         </w:tc>
@@ -4148,49 +3616,7 @@
                 <w:sz w:val="18"/>
                 <w:szCs w:val="18"/>
               </w:rPr>
-              <w:t>OPTIONAL MATCH (d)-</w:t>
-            </w:r>
-            <w:proofErr w:type="gramStart"/>
-            <w:r>
-              <w:rPr>
-                <w:rFonts w:ascii="Courier New" w:eastAsia="Courier New" w:hAnsi="Courier New" w:cs="Courier New"/>
-                <w:color w:val="FFFFFF" w:themeColor="background1"/>
-                <w:sz w:val="18"/>
-                <w:szCs w:val="18"/>
-              </w:rPr>
-              <w:t>[:DEPENDS</w:t>
-            </w:r>
-            <w:proofErr w:type="gramEnd"/>
-            <w:r>
-              <w:rPr>
-                <w:rFonts w:ascii="Courier New" w:eastAsia="Courier New" w:hAnsi="Courier New" w:cs="Courier New"/>
-                <w:color w:val="FFFFFF" w:themeColor="background1"/>
-                <w:sz w:val="18"/>
-                <w:szCs w:val="18"/>
-              </w:rPr>
-              <w:t>_ON]-&gt;(</w:t>
-            </w:r>
-            <w:proofErr w:type="spellStart"/>
-            <w:proofErr w:type="gramStart"/>
-            <w:r>
-              <w:rPr>
-                <w:rFonts w:ascii="Courier New" w:eastAsia="Courier New" w:hAnsi="Courier New" w:cs="Courier New"/>
-                <w:color w:val="FFFFFF" w:themeColor="background1"/>
-                <w:sz w:val="18"/>
-                <w:szCs w:val="18"/>
-              </w:rPr>
-              <w:t>a:Assumption</w:t>
-            </w:r>
-            <w:proofErr w:type="spellEnd"/>
-            <w:proofErr w:type="gramEnd"/>
-            <w:r>
-              <w:rPr>
-                <w:rFonts w:ascii="Courier New" w:eastAsia="Courier New" w:hAnsi="Courier New" w:cs="Courier New"/>
-                <w:color w:val="FFFFFF" w:themeColor="background1"/>
-                <w:sz w:val="18"/>
-                <w:szCs w:val="18"/>
-              </w:rPr>
-              <w:t>)</w:t>
+              <w:t>OPTIONAL MATCH (d)-[:DEPENDS_ON]-&gt;(a:Assumption)</w:t>
             </w:r>
           </w:p>
         </w:tc>
@@ -4227,49 +3653,7 @@
                 <w:sz w:val="18"/>
                 <w:szCs w:val="18"/>
               </w:rPr>
-              <w:t>OPTIONAL MATCH (d)-</w:t>
-            </w:r>
-            <w:proofErr w:type="gramStart"/>
-            <w:r>
-              <w:rPr>
-                <w:rFonts w:ascii="Courier New" w:eastAsia="Courier New" w:hAnsi="Courier New" w:cs="Courier New"/>
-                <w:color w:val="FFFFFF" w:themeColor="background1"/>
-                <w:sz w:val="18"/>
-                <w:szCs w:val="18"/>
-              </w:rPr>
-              <w:t>[:LIMITED</w:t>
-            </w:r>
-            <w:proofErr w:type="gramEnd"/>
-            <w:r>
-              <w:rPr>
-                <w:rFonts w:ascii="Courier New" w:eastAsia="Courier New" w:hAnsi="Courier New" w:cs="Courier New"/>
-                <w:color w:val="FFFFFF" w:themeColor="background1"/>
-                <w:sz w:val="18"/>
-                <w:szCs w:val="18"/>
-              </w:rPr>
-              <w:t>_BY]-&gt;(</w:t>
-            </w:r>
-            <w:proofErr w:type="spellStart"/>
-            <w:proofErr w:type="gramStart"/>
-            <w:r>
-              <w:rPr>
-                <w:rFonts w:ascii="Courier New" w:eastAsia="Courier New" w:hAnsi="Courier New" w:cs="Courier New"/>
-                <w:color w:val="FFFFFF" w:themeColor="background1"/>
-                <w:sz w:val="18"/>
-                <w:szCs w:val="18"/>
-              </w:rPr>
-              <w:t>u:Unknown</w:t>
-            </w:r>
-            <w:proofErr w:type="spellEnd"/>
-            <w:proofErr w:type="gramEnd"/>
-            <w:r>
-              <w:rPr>
-                <w:rFonts w:ascii="Courier New" w:eastAsia="Courier New" w:hAnsi="Courier New" w:cs="Courier New"/>
-                <w:color w:val="FFFFFF" w:themeColor="background1"/>
-                <w:sz w:val="18"/>
-                <w:szCs w:val="18"/>
-              </w:rPr>
-              <w:t>)</w:t>
+              <w:t>OPTIONAL MATCH (d)-[:LIMITED_BY]-&gt;(u:Unknown)</w:t>
             </w:r>
           </w:p>
         </w:tc>
@@ -4306,95 +3690,7 @@
                 <w:sz w:val="18"/>
                 <w:szCs w:val="18"/>
               </w:rPr>
-              <w:t xml:space="preserve">RETURN </w:t>
-            </w:r>
-            <w:proofErr w:type="spellStart"/>
-            <w:proofErr w:type="gramStart"/>
-            <w:r>
-              <w:rPr>
-                <w:rFonts w:ascii="Courier New" w:eastAsia="Courier New" w:hAnsi="Courier New" w:cs="Courier New"/>
-                <w:color w:val="FFFFFF" w:themeColor="background1"/>
-                <w:sz w:val="18"/>
-                <w:szCs w:val="18"/>
-              </w:rPr>
-              <w:t>d.context</w:t>
-            </w:r>
-            <w:proofErr w:type="spellEnd"/>
-            <w:proofErr w:type="gramEnd"/>
-            <w:r>
-              <w:rPr>
-                <w:rFonts w:ascii="Courier New" w:eastAsia="Courier New" w:hAnsi="Courier New" w:cs="Courier New"/>
-                <w:color w:val="FFFFFF" w:themeColor="background1"/>
-                <w:sz w:val="18"/>
-                <w:szCs w:val="18"/>
-              </w:rPr>
-              <w:t>, collect(</w:t>
-            </w:r>
-            <w:proofErr w:type="spellStart"/>
-            <w:proofErr w:type="gramStart"/>
-            <w:r>
-              <w:rPr>
-                <w:rFonts w:ascii="Courier New" w:eastAsia="Courier New" w:hAnsi="Courier New" w:cs="Courier New"/>
-                <w:color w:val="FFFFFF" w:themeColor="background1"/>
-                <w:sz w:val="18"/>
-                <w:szCs w:val="18"/>
-              </w:rPr>
-              <w:t>e.detail</w:t>
-            </w:r>
-            <w:proofErr w:type="spellEnd"/>
-            <w:proofErr w:type="gramEnd"/>
-            <w:r>
-              <w:rPr>
-                <w:rFonts w:ascii="Courier New" w:eastAsia="Courier New" w:hAnsi="Courier New" w:cs="Courier New"/>
-                <w:color w:val="FFFFFF" w:themeColor="background1"/>
-                <w:sz w:val="18"/>
-                <w:szCs w:val="18"/>
-              </w:rPr>
-              <w:t>), collect(</w:t>
-            </w:r>
-            <w:proofErr w:type="spellStart"/>
-            <w:proofErr w:type="gramStart"/>
-            <w:r>
-              <w:rPr>
-                <w:rFonts w:ascii="Courier New" w:eastAsia="Courier New" w:hAnsi="Courier New" w:cs="Courier New"/>
-                <w:color w:val="FFFFFF" w:themeColor="background1"/>
-                <w:sz w:val="18"/>
-                <w:szCs w:val="18"/>
-              </w:rPr>
-              <w:t>a.detail</w:t>
-            </w:r>
-            <w:proofErr w:type="spellEnd"/>
-            <w:proofErr w:type="gramEnd"/>
-            <w:r>
-              <w:rPr>
-                <w:rFonts w:ascii="Courier New" w:eastAsia="Courier New" w:hAnsi="Courier New" w:cs="Courier New"/>
-                <w:color w:val="FFFFFF" w:themeColor="background1"/>
-                <w:sz w:val="18"/>
-                <w:szCs w:val="18"/>
-              </w:rPr>
-              <w:t>), collect(</w:t>
-            </w:r>
-            <w:proofErr w:type="spellStart"/>
-            <w:proofErr w:type="gramStart"/>
-            <w:r>
-              <w:rPr>
-                <w:rFonts w:ascii="Courier New" w:eastAsia="Courier New" w:hAnsi="Courier New" w:cs="Courier New"/>
-                <w:color w:val="FFFFFF" w:themeColor="background1"/>
-                <w:sz w:val="18"/>
-                <w:szCs w:val="18"/>
-              </w:rPr>
-              <w:t>u.detail</w:t>
-            </w:r>
-            <w:proofErr w:type="spellEnd"/>
-            <w:proofErr w:type="gramEnd"/>
-            <w:r>
-              <w:rPr>
-                <w:rFonts w:ascii="Courier New" w:eastAsia="Courier New" w:hAnsi="Courier New" w:cs="Courier New"/>
-                <w:color w:val="FFFFFF" w:themeColor="background1"/>
-                <w:sz w:val="18"/>
-                <w:szCs w:val="18"/>
-              </w:rPr>
-              <w:t>)</w:t>
+              <w:t>RETURN d.context, collect(e.detail), collect(a.detail), collect(u.detail)</w:t>
             </w:r>
           </w:p>
         </w:tc>
@@ -4411,19 +3707,8 @@
           <w:bCs/>
           <w:color w:val="C9A84C"/>
         </w:rPr>
-        <w:t xml:space="preserve">Find all assumptions across all </w:t>
-      </w:r>
-      <w:proofErr w:type="gramStart"/>
-      <w:r>
-        <w:rPr>
-          <w:rFonts w:ascii="Arial" w:eastAsia="Arial" w:hAnsi="Arial" w:cs="Arial"/>
-          <w:b/>
-          <w:bCs/>
-          <w:color w:val="C9A84C"/>
-        </w:rPr>
-        <w:t>decisions</w:t>
-      </w:r>
-      <w:proofErr w:type="gramEnd"/>
+        <w:t>Find all assumptions across all decisions</w:t>
+      </w:r>
     </w:p>
     <w:tbl>
       <w:tblPr>
@@ -4479,71 +3764,7 @@
                 <w:sz w:val="18"/>
                 <w:szCs w:val="18"/>
               </w:rPr>
-              <w:t>MATCH (</w:t>
-            </w:r>
-            <w:proofErr w:type="spellStart"/>
-            <w:proofErr w:type="gramStart"/>
-            <w:r>
-              <w:rPr>
-                <w:rFonts w:ascii="Courier New" w:eastAsia="Courier New" w:hAnsi="Courier New" w:cs="Courier New"/>
-                <w:color w:val="FFFFFF" w:themeColor="background1"/>
-                <w:sz w:val="18"/>
-                <w:szCs w:val="18"/>
-              </w:rPr>
-              <w:t>d:Decision</w:t>
-            </w:r>
-            <w:proofErr w:type="spellEnd"/>
-            <w:proofErr w:type="gramEnd"/>
-            <w:r>
-              <w:rPr>
-                <w:rFonts w:ascii="Courier New" w:eastAsia="Courier New" w:hAnsi="Courier New" w:cs="Courier New"/>
-                <w:color w:val="FFFFFF" w:themeColor="background1"/>
-                <w:sz w:val="18"/>
-                <w:szCs w:val="18"/>
-              </w:rPr>
-              <w:t>)-</w:t>
-            </w:r>
-            <w:proofErr w:type="gramStart"/>
-            <w:r>
-              <w:rPr>
-                <w:rFonts w:ascii="Courier New" w:eastAsia="Courier New" w:hAnsi="Courier New" w:cs="Courier New"/>
-                <w:color w:val="FFFFFF" w:themeColor="background1"/>
-                <w:sz w:val="18"/>
-                <w:szCs w:val="18"/>
-              </w:rPr>
-              <w:t>[:DEPENDS</w:t>
-            </w:r>
-            <w:proofErr w:type="gramEnd"/>
-            <w:r>
-              <w:rPr>
-                <w:rFonts w:ascii="Courier New" w:eastAsia="Courier New" w:hAnsi="Courier New" w:cs="Courier New"/>
-                <w:color w:val="FFFFFF" w:themeColor="background1"/>
-                <w:sz w:val="18"/>
-                <w:szCs w:val="18"/>
-              </w:rPr>
-              <w:t>_ON]-&gt;(</w:t>
-            </w:r>
-            <w:proofErr w:type="spellStart"/>
-            <w:proofErr w:type="gramStart"/>
-            <w:r>
-              <w:rPr>
-                <w:rFonts w:ascii="Courier New" w:eastAsia="Courier New" w:hAnsi="Courier New" w:cs="Courier New"/>
-                <w:color w:val="FFFFFF" w:themeColor="background1"/>
-                <w:sz w:val="18"/>
-                <w:szCs w:val="18"/>
-              </w:rPr>
-              <w:t>a:Assumption</w:t>
-            </w:r>
-            <w:proofErr w:type="spellEnd"/>
-            <w:proofErr w:type="gramEnd"/>
-            <w:r>
-              <w:rPr>
-                <w:rFonts w:ascii="Courier New" w:eastAsia="Courier New" w:hAnsi="Courier New" w:cs="Courier New"/>
-                <w:color w:val="FFFFFF" w:themeColor="background1"/>
-                <w:sz w:val="18"/>
-                <w:szCs w:val="18"/>
-              </w:rPr>
-              <w:t>)</w:t>
+              <w:t>MATCH (d:Decision)-[:DEPENDS_ON]-&gt;(a:Assumption)</w:t>
             </w:r>
           </w:p>
         </w:tc>
@@ -4580,51 +3801,7 @@
                 <w:sz w:val="18"/>
                 <w:szCs w:val="18"/>
               </w:rPr>
-              <w:t xml:space="preserve">RETURN </w:t>
-            </w:r>
-            <w:proofErr w:type="spellStart"/>
-            <w:proofErr w:type="gramStart"/>
-            <w:r>
-              <w:rPr>
-                <w:rFonts w:ascii="Courier New" w:eastAsia="Courier New" w:hAnsi="Courier New" w:cs="Courier New"/>
-                <w:color w:val="FFFFFF" w:themeColor="background1"/>
-                <w:sz w:val="18"/>
-                <w:szCs w:val="18"/>
-              </w:rPr>
-              <w:t>d.context</w:t>
-            </w:r>
-            <w:proofErr w:type="spellEnd"/>
-            <w:proofErr w:type="gramEnd"/>
-            <w:r>
-              <w:rPr>
-                <w:rFonts w:ascii="Courier New" w:eastAsia="Courier New" w:hAnsi="Courier New" w:cs="Courier New"/>
-                <w:color w:val="FFFFFF" w:themeColor="background1"/>
-                <w:sz w:val="18"/>
-                <w:szCs w:val="18"/>
-              </w:rPr>
-              <w:t xml:space="preserve"> AS decision, </w:t>
-            </w:r>
-            <w:proofErr w:type="spellStart"/>
-            <w:proofErr w:type="gramStart"/>
-            <w:r>
-              <w:rPr>
-                <w:rFonts w:ascii="Courier New" w:eastAsia="Courier New" w:hAnsi="Courier New" w:cs="Courier New"/>
-                <w:color w:val="FFFFFF" w:themeColor="background1"/>
-                <w:sz w:val="18"/>
-                <w:szCs w:val="18"/>
-              </w:rPr>
-              <w:t>a.detail</w:t>
-            </w:r>
-            <w:proofErr w:type="spellEnd"/>
-            <w:proofErr w:type="gramEnd"/>
-            <w:r>
-              <w:rPr>
-                <w:rFonts w:ascii="Courier New" w:eastAsia="Courier New" w:hAnsi="Courier New" w:cs="Courier New"/>
-                <w:color w:val="FFFFFF" w:themeColor="background1"/>
-                <w:sz w:val="18"/>
-                <w:szCs w:val="18"/>
-              </w:rPr>
-              <w:t xml:space="preserve"> AS assumption</w:t>
+              <w:t>RETURN d.context AS decision, a.detail AS assumption</w:t>
             </w:r>
           </w:p>
         </w:tc>
@@ -4732,19 +3909,8 @@
           <w:bCs/>
           <w:color w:val="C9A84C"/>
         </w:rPr>
-        <w:t xml:space="preserve">Start it </w:t>
-      </w:r>
-      <w:proofErr w:type="gramStart"/>
-      <w:r>
-        <w:rPr>
-          <w:rFonts w:ascii="Arial" w:eastAsia="Arial" w:hAnsi="Arial" w:cs="Arial"/>
-          <w:b/>
-          <w:bCs/>
-          <w:color w:val="C9A84C"/>
-        </w:rPr>
-        <w:t>again</w:t>
-      </w:r>
-      <w:proofErr w:type="gramEnd"/>
+        <w:t>Start it again</w:t>
+      </w:r>
     </w:p>
     <w:tbl>
       <w:tblPr>
@@ -4814,19 +3980,8 @@
           <w:bCs/>
           <w:color w:val="C9A84C"/>
         </w:rPr>
-        <w:t xml:space="preserve">Wipe everything and start </w:t>
-      </w:r>
-      <w:proofErr w:type="gramStart"/>
-      <w:r>
-        <w:rPr>
-          <w:rFonts w:ascii="Arial" w:eastAsia="Arial" w:hAnsi="Arial" w:cs="Arial"/>
-          <w:b/>
-          <w:bCs/>
-          <w:color w:val="C9A84C"/>
-        </w:rPr>
-        <w:t>fresh</w:t>
-      </w:r>
-      <w:proofErr w:type="gramEnd"/>
+        <w:t>Wipe everything and start fresh</w:t>
+      </w:r>
     </w:p>
     <w:tbl>
       <w:tblPr>
@@ -4931,19 +4086,8 @@
           <w:bCs/>
           <w:color w:val="C9A84C"/>
         </w:rPr>
-        <w:t xml:space="preserve">Wipe ChromaDB vector </w:t>
-      </w:r>
-      <w:proofErr w:type="gramStart"/>
-      <w:r>
-        <w:rPr>
-          <w:rFonts w:ascii="Arial" w:eastAsia="Arial" w:hAnsi="Arial" w:cs="Arial"/>
-          <w:b/>
-          <w:bCs/>
-          <w:color w:val="C9A84C"/>
-        </w:rPr>
-        <w:t>memory</w:t>
-      </w:r>
-      <w:proofErr w:type="gramEnd"/>
+        <w:t>Wipe ChromaDB vector memory</w:t>
+      </w:r>
     </w:p>
     <w:tbl>
       <w:tblPr>
@@ -5372,7 +4516,6 @@
             </w:tcMar>
           </w:tcPr>
           <w:p>
-            <w:proofErr w:type="spellStart"/>
             <w:r>
               <w:rPr>
                 <w:rFonts w:ascii="Arial" w:eastAsia="Arial" w:hAnsi="Arial" w:cs="Arial"/>
@@ -5380,17 +4523,7 @@
                 <w:sz w:val="18"/>
                 <w:szCs w:val="18"/>
               </w:rPr>
-              <w:t>ModuleNotFoundError</w:t>
-            </w:r>
-            <w:proofErr w:type="spellEnd"/>
-            <w:r>
-              <w:rPr>
-                <w:rFonts w:ascii="Arial" w:eastAsia="Arial" w:hAnsi="Arial" w:cs="Arial"/>
-                <w:color w:val="2C2C2A"/>
-                <w:sz w:val="18"/>
-                <w:szCs w:val="18"/>
-              </w:rPr>
-              <w:t>: neo4j</w:t>
+              <w:t>ModuleNotFoundError: neo4j</w:t>
             </w:r>
           </w:p>
         </w:tc>
@@ -5448,27 +4581,7 @@
                 <w:sz w:val="18"/>
                 <w:szCs w:val="18"/>
               </w:rPr>
-              <w:t xml:space="preserve">Run </w:t>
-            </w:r>
-            <w:proofErr w:type="gramStart"/>
-            <w:r>
-              <w:rPr>
-                <w:rFonts w:ascii="Arial" w:eastAsia="Arial" w:hAnsi="Arial" w:cs="Arial"/>
-                <w:color w:val="2C2C2A"/>
-                <w:sz w:val="18"/>
-                <w:szCs w:val="18"/>
-              </w:rPr>
-              <w:t>pip</w:t>
-            </w:r>
-            <w:proofErr w:type="gramEnd"/>
-            <w:r>
-              <w:rPr>
-                <w:rFonts w:ascii="Arial" w:eastAsia="Arial" w:hAnsi="Arial" w:cs="Arial"/>
-                <w:color w:val="2C2C2A"/>
-                <w:sz w:val="18"/>
-                <w:szCs w:val="18"/>
-              </w:rPr>
-              <w:t xml:space="preserve"> install -r requirements.txt</w:t>
+              <w:t>Run pip install -r requirements.txt</w:t>
             </w:r>
           </w:p>
         </w:tc>
@@ -5498,7 +4611,6 @@
             </w:tcMar>
           </w:tcPr>
           <w:p>
-            <w:proofErr w:type="spellStart"/>
             <w:r>
               <w:rPr>
                 <w:rFonts w:ascii="Arial" w:eastAsia="Arial" w:hAnsi="Arial" w:cs="Arial"/>
@@ -5506,17 +4618,7 @@
                 <w:sz w:val="18"/>
                 <w:szCs w:val="18"/>
               </w:rPr>
-              <w:t>ClientError</w:t>
-            </w:r>
-            <w:proofErr w:type="spellEnd"/>
-            <w:r>
-              <w:rPr>
-                <w:rFonts w:ascii="Arial" w:eastAsia="Arial" w:hAnsi="Arial" w:cs="Arial"/>
-                <w:color w:val="2C2C2A"/>
-                <w:sz w:val="18"/>
-                <w:szCs w:val="18"/>
-              </w:rPr>
-              <w:t>: Schema operations</w:t>
+              <w:t>ClientError: Schema operations</w:t>
             </w:r>
           </w:p>
         </w:tc>
@@ -5670,6 +4772,386 @@
                 <w:szCs w:val="18"/>
               </w:rPr>
               <w:t>Wait 30 seconds, try again</w:t>
+            </w:r>
+          </w:p>
+        </w:tc>
+      </w:tr>
+      <w:tr>
+        <w:tblPrEx>
+          <w:tblCellMar>
+            <w:top w:w="0" w:type="dxa"/>
+            <w:bottom w:w="0" w:type="dxa"/>
+          </w:tblCellMar>
+        </w:tblPrEx>
+        <w:tc>
+          <w:tcPr>
+            <w:tcW w:w="3000" w:type="dxa"/>
+            <w:tcBorders>
+              <w:top w:val="single" w:sz="4" w:space="0" w:color="DDDDCC"/>
+              <w:left w:val="none" w:sz="0" w:space="0" w:color="FFFFFF"/>
+              <w:bottom w:val="single" w:sz="4" w:space="0" w:color="DDDDCC"/>
+              <w:right w:val="none" w:sz="0" w:space="0" w:color="FFFFFF"/>
+            </w:tcBorders>
+            <w:shd w:val="clear" w:color="auto" w:fill="F5F5F0"/>
+            <w:tcMar>
+              <w:top w:w="80" w:type="dxa"/>
+              <w:left w:w="120" w:type="dxa"/>
+              <w:bottom w:w="80" w:type="dxa"/>
+              <w:right w:w="120" w:type="dxa"/>
+            </w:tcMar>
+          </w:tcPr>
+          <w:p>
+            <w:r>
+              <w:rPr>
+                <w:rFonts w:ascii="Arial" w:eastAsia="Arial" w:hAnsi="Arial" w:cs="Arial"/>
+                <w:color w:val="2C2C2A"/>
+                <w:sz w:val="18"/>
+                <w:szCs w:val="18"/>
+              </w:rPr>
+              <w:t>Dashboard’s Graph Engine Status says Unauthorized</w:t>
+            </w:r>
+          </w:p>
+        </w:tc>
+        <w:tc>
+          <w:tcPr>
+            <w:tcW w:w="2800" w:type="dxa"/>
+            <w:tcBorders>
+              <w:top w:val="single" w:sz="4" w:space="0" w:color="DDDDCC"/>
+              <w:left w:val="none" w:sz="0" w:space="0" w:color="FFFFFF"/>
+              <w:bottom w:val="single" w:sz="4" w:space="0" w:color="DDDDCC"/>
+              <w:right w:val="none" w:sz="0" w:space="0" w:color="FFFFFF"/>
+            </w:tcBorders>
+            <w:shd w:val="clear" w:color="auto" w:fill="F5F5F0"/>
+            <w:tcMar>
+              <w:top w:w="80" w:type="dxa"/>
+              <w:left w:w="120" w:type="dxa"/>
+              <w:bottom w:w="80" w:type="dxa"/>
+              <w:right w:w="120" w:type="dxa"/>
+            </w:tcMar>
+          </w:tcPr>
+          <w:p>
+            <w:r>
+              <w:rPr>
+                <w:rFonts w:ascii="Arial" w:eastAsia="Arial" w:hAnsi="Arial" w:cs="Arial"/>
+                <w:color w:val="2C2C2A"/>
+                <w:sz w:val="18"/>
+                <w:szCs w:val="18"/>
+              </w:rPr>
+              <w:t>Neo4j Desktop’s “korum-lab” instance is running and holding port 7687 instead of Docker’s Neo4j</w:t>
+            </w:r>
+          </w:p>
+        </w:tc>
+        <w:tc>
+          <w:tcPr>
+            <w:tcW w:w="3560" w:type="dxa"/>
+            <w:tcBorders>
+              <w:top w:val="single" w:sz="4" w:space="0" w:color="DDDDCC"/>
+              <w:left w:val="none" w:sz="0" w:space="0" w:color="FFFFFF"/>
+              <w:bottom w:val="single" w:sz="4" w:space="0" w:color="DDDDCC"/>
+              <w:right w:val="none" w:sz="0" w:space="0" w:color="FFFFFF"/>
+            </w:tcBorders>
+            <w:shd w:val="clear" w:color="auto" w:fill="F5F5F0"/>
+            <w:tcMar>
+              <w:top w:w="80" w:type="dxa"/>
+              <w:left w:w="120" w:type="dxa"/>
+              <w:bottom w:w="80" w:type="dxa"/>
+              <w:right w:w="120" w:type="dxa"/>
+            </w:tcMar>
+          </w:tcPr>
+          <w:p>
+            <w:r>
+              <w:rPr>
+                <w:rFonts w:ascii="Arial" w:eastAsia="Arial" w:hAnsi="Arial" w:cs="Arial"/>
+                <w:color w:val="2C2C2A"/>
+                <w:sz w:val="18"/>
+                <w:szCs w:val="18"/>
+              </w:rPr>
+              <w:t>Stop “korum-lab” in Neo4j Desktop → Local instances, then re-run start_korum.bat</w:t>
+            </w:r>
+          </w:p>
+        </w:tc>
+      </w:tr>
+      <w:tr>
+        <w:tblPrEx>
+          <w:tblCellMar>
+            <w:top w:w="0" w:type="dxa"/>
+            <w:bottom w:w="0" w:type="dxa"/>
+          </w:tblCellMar>
+        </w:tblPrEx>
+        <w:tc>
+          <w:tcPr>
+            <w:tcW w:w="3000" w:type="dxa"/>
+            <w:tcBorders>
+              <w:top w:val="single" w:sz="4" w:space="0" w:color="DDDDCC"/>
+              <w:left w:val="none" w:sz="0" w:space="0" w:color="FFFFFF"/>
+              <w:bottom w:val="single" w:sz="4" w:space="0" w:color="DDDDCC"/>
+              <w:right w:val="none" w:sz="0" w:space="0" w:color="FFFFFF"/>
+            </w:tcBorders>
+            <w:shd w:val="clear" w:color="auto" w:fill="F5F5F0"/>
+            <w:tcMar>
+              <w:top w:w="80" w:type="dxa"/>
+              <w:left w:w="120" w:type="dxa"/>
+              <w:bottom w:w="80" w:type="dxa"/>
+              <w:right w:w="120" w:type="dxa"/>
+            </w:tcMar>
+          </w:tcPr>
+          <w:p>
+            <w:r>
+              <w:rPr>
+                <w:rFonts w:ascii="Arial" w:eastAsia="Arial" w:hAnsi="Arial" w:cs="Arial"/>
+                <w:color w:val="2C2C2A"/>
+                <w:sz w:val="18"/>
+                <w:szCs w:val="18"/>
+              </w:rPr>
+              <w:t>“.env: line N: key cannot contain a space”</w:t>
+            </w:r>
+          </w:p>
+        </w:tc>
+        <w:tc>
+          <w:tcPr>
+            <w:tcW w:w="2800" w:type="dxa"/>
+            <w:tcBorders>
+              <w:top w:val="single" w:sz="4" w:space="0" w:color="DDDDCC"/>
+              <w:left w:val="none" w:sz="0" w:space="0" w:color="FFFFFF"/>
+              <w:bottom w:val="single" w:sz="4" w:space="0" w:color="DDDDCC"/>
+              <w:right w:val="none" w:sz="0" w:space="0" w:color="FFFFFF"/>
+            </w:tcBorders>
+            <w:shd w:val="clear" w:color="auto" w:fill="F5F5F0"/>
+            <w:tcMar>
+              <w:top w:w="80" w:type="dxa"/>
+              <w:left w:w="120" w:type="dxa"/>
+              <w:bottom w:w="80" w:type="dxa"/>
+              <w:right w:w="120" w:type="dxa"/>
+            </w:tcMar>
+          </w:tcPr>
+          <w:p>
+            <w:r>
+              <w:rPr>
+                <w:rFonts w:ascii="Arial" w:eastAsia="Arial" w:hAnsi="Arial" w:cs="Arial"/>
+                <w:color w:val="2C2C2A"/>
+                <w:sz w:val="18"/>
+                <w:szCs w:val="18"/>
+              </w:rPr>
+              <w:t>A line in .env has a key with a space in it (e.g. foundry api key=...)</w:t>
+            </w:r>
+          </w:p>
+        </w:tc>
+        <w:tc>
+          <w:tcPr>
+            <w:tcW w:w="3560" w:type="dxa"/>
+            <w:tcBorders>
+              <w:top w:val="single" w:sz="4" w:space="0" w:color="DDDDCC"/>
+              <w:left w:val="none" w:sz="0" w:space="0" w:color="FFFFFF"/>
+              <w:bottom w:val="single" w:sz="4" w:space="0" w:color="DDDDCC"/>
+              <w:right w:val="none" w:sz="0" w:space="0" w:color="FFFFFF"/>
+            </w:tcBorders>
+            <w:shd w:val="clear" w:color="auto" w:fill="F5F5F0"/>
+            <w:tcMar>
+              <w:top w:w="80" w:type="dxa"/>
+              <w:left w:w="120" w:type="dxa"/>
+              <w:bottom w:w="80" w:type="dxa"/>
+              <w:right w:w="120" w:type="dxa"/>
+            </w:tcMar>
+          </w:tcPr>
+          <w:p>
+            <w:r>
+              <w:rPr>
+                <w:rFonts w:ascii="Arial" w:eastAsia="Arial" w:hAnsi="Arial" w:cs="Arial"/>
+                <w:color w:val="2C2C2A"/>
+                <w:sz w:val="18"/>
+                <w:szCs w:val="18"/>
+              </w:rPr>
+              <w:t>Rename the key to a valid env-var format, e.g. FOUNDRY_API_KEY=... (no spaces)</w:t>
+            </w:r>
+          </w:p>
+        </w:tc>
+      </w:tr>
+      <w:tr>
+        <w:tblPrEx>
+          <w:tblCellMar>
+            <w:top w:w="0" w:type="dxa"/>
+            <w:bottom w:w="0" w:type="dxa"/>
+          </w:tblCellMar>
+        </w:tblPrEx>
+        <w:tc>
+          <w:tcPr>
+            <w:tcW w:w="3000" w:type="dxa"/>
+            <w:tcBorders>
+              <w:top w:val="single" w:sz="4" w:space="0" w:color="DDDDCC"/>
+              <w:left w:val="none" w:sz="0" w:space="0" w:color="FFFFFF"/>
+              <w:bottom w:val="single" w:sz="4" w:space="0" w:color="DDDDCC"/>
+              <w:right w:val="none" w:sz="0" w:space="0" w:color="FFFFFF"/>
+            </w:tcBorders>
+            <w:shd w:val="clear" w:color="auto" w:fill="F5F5F0"/>
+            <w:tcMar>
+              <w:top w:w="80" w:type="dxa"/>
+              <w:left w:w="120" w:type="dxa"/>
+              <w:bottom w:w="80" w:type="dxa"/>
+              <w:right w:w="120" w:type="dxa"/>
+            </w:tcMar>
+          </w:tcPr>
+          <w:p>
+            <w:r>
+              <w:rPr>
+                <w:rFonts w:ascii="Arial" w:eastAsia="Arial" w:hAnsi="Arial" w:cs="Arial"/>
+                <w:color w:val="2C2C2A"/>
+                <w:sz w:val="18"/>
+                <w:szCs w:val="18"/>
+              </w:rPr>
+              <w:t>UnsupportedAdministrationCommand on CREATE DATABASE</w:t>
+            </w:r>
+          </w:p>
+        </w:tc>
+        <w:tc>
+          <w:tcPr>
+            <w:tcW w:w="2800" w:type="dxa"/>
+            <w:tcBorders>
+              <w:top w:val="single" w:sz="4" w:space="0" w:color="DDDDCC"/>
+              <w:left w:val="none" w:sz="0" w:space="0" w:color="FFFFFF"/>
+              <w:bottom w:val="single" w:sz="4" w:space="0" w:color="DDDDCC"/>
+              <w:right w:val="none" w:sz="0" w:space="0" w:color="FFFFFF"/>
+            </w:tcBorders>
+            <w:shd w:val="clear" w:color="auto" w:fill="F5F5F0"/>
+            <w:tcMar>
+              <w:top w:w="80" w:type="dxa"/>
+              <w:left w:w="120" w:type="dxa"/>
+              <w:bottom w:w="80" w:type="dxa"/>
+              <w:right w:w="120" w:type="dxa"/>
+            </w:tcMar>
+          </w:tcPr>
+          <w:p>
+            <w:r>
+              <w:rPr>
+                <w:rFonts w:ascii="Arial" w:eastAsia="Arial" w:hAnsi="Arial" w:cs="Arial"/>
+                <w:color w:val="2C2C2A"/>
+                <w:sz w:val="18"/>
+                <w:szCs w:val="18"/>
+              </w:rPr>
+              <w:t>Community Edition only supports the default neo4j database — multiple databases are an Enterprise feature</w:t>
+            </w:r>
+          </w:p>
+        </w:tc>
+        <w:tc>
+          <w:tcPr>
+            <w:tcW w:w="3560" w:type="dxa"/>
+            <w:tcBorders>
+              <w:top w:val="single" w:sz="4" w:space="0" w:color="DDDDCC"/>
+              <w:left w:val="none" w:sz="0" w:space="0" w:color="FFFFFF"/>
+              <w:bottom w:val="single" w:sz="4" w:space="0" w:color="DDDDCC"/>
+              <w:right w:val="none" w:sz="0" w:space="0" w:color="FFFFFF"/>
+            </w:tcBorders>
+            <w:shd w:val="clear" w:color="auto" w:fill="F5F5F0"/>
+            <w:tcMar>
+              <w:top w:w="80" w:type="dxa"/>
+              <w:left w:w="120" w:type="dxa"/>
+              <w:bottom w:w="80" w:type="dxa"/>
+              <w:right w:w="120" w:type="dxa"/>
+            </w:tcMar>
+          </w:tcPr>
+          <w:p>
+            <w:r>
+              <w:rPr>
+                <w:rFonts w:ascii="Arial" w:eastAsia="Arial" w:hAnsi="Arial" w:cs="Arial"/>
+                <w:color w:val="2C2C2A"/>
+                <w:sz w:val="18"/>
+                <w:szCs w:val="18"/>
+              </w:rPr>
+              <w:t>Don’t create new databases; use NEO4J_DATABASE=neo4j in .env, not a custom name</w:t>
+            </w:r>
+          </w:p>
+        </w:tc>
+      </w:tr>
+      <w:tr>
+        <w:tblPrEx>
+          <w:tblCellMar>
+            <w:top w:w="0" w:type="dxa"/>
+            <w:bottom w:w="0" w:type="dxa"/>
+          </w:tblCellMar>
+        </w:tblPrEx>
+        <w:tc>
+          <w:tcPr>
+            <w:tcW w:w="3000" w:type="dxa"/>
+            <w:tcBorders>
+              <w:top w:val="single" w:sz="4" w:space="0" w:color="DDDDCC"/>
+              <w:left w:val="none" w:sz="0" w:space="0" w:color="FFFFFF"/>
+              <w:bottom w:val="single" w:sz="4" w:space="0" w:color="DDDDCC"/>
+              <w:right w:val="none" w:sz="0" w:space="0" w:color="FFFFFF"/>
+            </w:tcBorders>
+            <w:shd w:val="clear" w:color="auto" w:fill="F5F5F0"/>
+            <w:tcMar>
+              <w:top w:w="80" w:type="dxa"/>
+              <w:left w:w="120" w:type="dxa"/>
+              <w:bottom w:w="80" w:type="dxa"/>
+              <w:right w:w="120" w:type="dxa"/>
+            </w:tcMar>
+          </w:tcPr>
+          <w:p>
+            <w:r>
+              <w:rPr>
+                <w:rFonts w:ascii="Arial" w:eastAsia="Arial" w:hAnsi="Arial" w:cs="Arial"/>
+                <w:color w:val="2C2C2A"/>
+                <w:sz w:val="18"/>
+                <w:szCs w:val="18"/>
+              </w:rPr>
+              <w:t>Backend terminal shows no log lines even though the dashboard got a real response</w:t>
+            </w:r>
+          </w:p>
+        </w:tc>
+        <w:tc>
+          <w:tcPr>
+            <w:tcW w:w="2800" w:type="dxa"/>
+            <w:tcBorders>
+              <w:top w:val="single" w:sz="4" w:space="0" w:color="DDDDCC"/>
+              <w:left w:val="none" w:sz="0" w:space="0" w:color="FFFFFF"/>
+              <w:bottom w:val="single" w:sz="4" w:space="0" w:color="DDDDCC"/>
+              <w:right w:val="none" w:sz="0" w:space="0" w:color="FFFFFF"/>
+            </w:tcBorders>
+            <w:shd w:val="clear" w:color="auto" w:fill="F5F5F0"/>
+            <w:tcMar>
+              <w:top w:w="80" w:type="dxa"/>
+              <w:left w:w="120" w:type="dxa"/>
+              <w:bottom w:w="80" w:type="dxa"/>
+              <w:right w:w="120" w:type="dxa"/>
+            </w:tcMar>
+          </w:tcPr>
+          <w:p>
+            <w:r>
+              <w:rPr>
+                <w:rFonts w:ascii="Arial" w:eastAsia="Arial" w:hAnsi="Arial" w:cs="Arial"/>
+                <w:color w:val="2C2C2A"/>
+                <w:sz w:val="18"/>
+                <w:szCs w:val="18"/>
+              </w:rPr>
+              <w:t>An old backend process from a previous run is still alive on port 8000, answering with stale settings</w:t>
+            </w:r>
+          </w:p>
+        </w:tc>
+        <w:tc>
+          <w:tcPr>
+            <w:tcW w:w="3560" w:type="dxa"/>
+            <w:tcBorders>
+              <w:top w:val="single" w:sz="4" w:space="0" w:color="DDDDCC"/>
+              <w:left w:val="none" w:sz="0" w:space="0" w:color="FFFFFF"/>
+              <w:bottom w:val="single" w:sz="4" w:space="0" w:color="DDDDCC"/>
+              <w:right w:val="none" w:sz="0" w:space="0" w:color="FFFFFF"/>
+            </w:tcBorders>
+            <w:shd w:val="clear" w:color="auto" w:fill="F5F5F0"/>
+            <w:tcMar>
+              <w:top w:w="80" w:type="dxa"/>
+              <w:left w:w="120" w:type="dxa"/>
+              <w:bottom w:w="80" w:type="dxa"/>
+              <w:right w:w="120" w:type="dxa"/>
+            </w:tcMar>
+          </w:tcPr>
+          <w:p>
+            <w:r>
+              <w:rPr>
+                <w:rFonts w:ascii="Arial" w:eastAsia="Arial" w:hAnsi="Arial" w:cs="Arial"/>
+                <w:color w:val="2C2C2A"/>
+                <w:sz w:val="18"/>
+                <w:szCs w:val="18"/>
+              </w:rPr>
+              <w:t>Close every terminal window (PowerShell/cmd) tied to this project, then re-run start_korum.bat for a clean single process</w:t>
             </w:r>
           </w:p>
         </w:tc>
@@ -5742,7 +5224,6 @@
                 <w:color w:val="FFFFFF" w:themeColor="background1"/>
               </w:rPr>
             </w:pPr>
-            <w:proofErr w:type="spellStart"/>
             <w:r>
               <w:rPr>
                 <w:rFonts w:ascii="Courier New" w:eastAsia="Courier New" w:hAnsi="Courier New" w:cs="Courier New"/>
@@ -5750,17 +5231,7 @@
                 <w:sz w:val="18"/>
                 <w:szCs w:val="18"/>
               </w:rPr>
-              <w:t>DecisionFormation</w:t>
-            </w:r>
-            <w:proofErr w:type="spellEnd"/>
-            <w:r>
-              <w:rPr>
-                <w:rFonts w:ascii="Courier New" w:eastAsia="Courier New" w:hAnsi="Courier New" w:cs="Courier New"/>
-                <w:color w:val="FFFFFF" w:themeColor="background1"/>
-                <w:sz w:val="18"/>
-                <w:szCs w:val="18"/>
-              </w:rPr>
-              <w:t>/</w:t>
+              <w:t>DecisionFormation/</w:t>
             </w:r>
           </w:p>
         </w:tc>
@@ -5834,27 +5305,7 @@
                 <w:sz w:val="18"/>
                 <w:szCs w:val="18"/>
               </w:rPr>
-              <w:t>├── docker-</w:t>
-            </w:r>
-            <w:proofErr w:type="spellStart"/>
-            <w:r>
-              <w:rPr>
-                <w:rFonts w:ascii="Courier New" w:eastAsia="Courier New" w:hAnsi="Courier New" w:cs="Courier New"/>
-                <w:color w:val="FFFFFF" w:themeColor="background1"/>
-                <w:sz w:val="18"/>
-                <w:szCs w:val="18"/>
-              </w:rPr>
-              <w:t>compose.yml</w:t>
-            </w:r>
-            <w:proofErr w:type="spellEnd"/>
-            <w:r>
-              <w:rPr>
-                <w:rFonts w:ascii="Courier New" w:eastAsia="Courier New" w:hAnsi="Courier New" w:cs="Courier New"/>
-                <w:color w:val="FFFFFF" w:themeColor="background1"/>
-                <w:sz w:val="18"/>
-                <w:szCs w:val="18"/>
-              </w:rPr>
-              <w:t xml:space="preserve">       Neo4j container config</w:t>
+              <w:t>├── docker-compose.yml       Neo4j container config</w:t>
             </w:r>
           </w:p>
         </w:tc>
@@ -6113,27 +5564,7 @@
                 <w:sz w:val="18"/>
                 <w:szCs w:val="18"/>
               </w:rPr>
-              <w:t xml:space="preserve">└── </w:t>
-            </w:r>
-            <w:proofErr w:type="spellStart"/>
-            <w:r>
-              <w:rPr>
-                <w:rFonts w:ascii="Courier New" w:eastAsia="Courier New" w:hAnsi="Courier New" w:cs="Courier New"/>
-                <w:color w:val="FFFFFF" w:themeColor="background1"/>
-                <w:sz w:val="18"/>
-                <w:szCs w:val="18"/>
-              </w:rPr>
-              <w:t>korum_lab</w:t>
-            </w:r>
-            <w:proofErr w:type="spellEnd"/>
-            <w:r>
-              <w:rPr>
-                <w:rFonts w:ascii="Courier New" w:eastAsia="Courier New" w:hAnsi="Courier New" w:cs="Courier New"/>
-                <w:color w:val="FFFFFF" w:themeColor="background1"/>
-                <w:sz w:val="18"/>
-                <w:szCs w:val="18"/>
-              </w:rPr>
-              <w:t>/               Modular package</w:t>
+              <w:t>└── korum_lab/               Modular package</w:t>
             </w:r>
           </w:p>
         </w:tc>
@@ -6244,27 +5675,7 @@
                 <w:sz w:val="18"/>
                 <w:szCs w:val="18"/>
               </w:rPr>
-              <w:t xml:space="preserve">    ├── main.py                Full orchestration (all </w:t>
-            </w:r>
-            <w:proofErr w:type="gramStart"/>
-            <w:r>
-              <w:rPr>
-                <w:rFonts w:ascii="Courier New" w:eastAsia="Courier New" w:hAnsi="Courier New" w:cs="Courier New"/>
-                <w:color w:val="FFFFFF" w:themeColor="background1"/>
-                <w:sz w:val="18"/>
-                <w:szCs w:val="18"/>
-              </w:rPr>
-              <w:t>4</w:t>
-            </w:r>
-            <w:proofErr w:type="gramEnd"/>
-            <w:r>
-              <w:rPr>
-                <w:rFonts w:ascii="Courier New" w:eastAsia="Courier New" w:hAnsi="Courier New" w:cs="Courier New"/>
-                <w:color w:val="FFFFFF" w:themeColor="background1"/>
-                <w:sz w:val="18"/>
-                <w:szCs w:val="18"/>
-              </w:rPr>
-              <w:t xml:space="preserve"> stages)</w:t>
+              <w:t xml:space="preserve">    ├── main.py                Full orchestration (all 4 stages)</w:t>
             </w:r>
           </w:p>
         </w:tc>
@@ -6412,27 +5823,7 @@
                 <w:sz w:val="18"/>
                 <w:szCs w:val="18"/>
               </w:rPr>
-              <w:t xml:space="preserve">        ├── driver.py          Neo4j </w:t>
-            </w:r>
-            <w:proofErr w:type="gramStart"/>
-            <w:r>
-              <w:rPr>
-                <w:rFonts w:ascii="Courier New" w:eastAsia="Courier New" w:hAnsi="Courier New" w:cs="Courier New"/>
-                <w:color w:val="FFFFFF" w:themeColor="background1"/>
-                <w:sz w:val="18"/>
-                <w:szCs w:val="18"/>
-              </w:rPr>
-              <w:t>singleton</w:t>
-            </w:r>
-            <w:proofErr w:type="gramEnd"/>
-            <w:r>
-              <w:rPr>
-                <w:rFonts w:ascii="Courier New" w:eastAsia="Courier New" w:hAnsi="Courier New" w:cs="Courier New"/>
-                <w:color w:val="FFFFFF" w:themeColor="background1"/>
-                <w:sz w:val="18"/>
-                <w:szCs w:val="18"/>
-              </w:rPr>
-              <w:t xml:space="preserve"> connection manager</w:t>
+              <w:t xml:space="preserve">        ├── driver.py          Neo4j singleton connection manager</w:t>
             </w:r>
           </w:p>
         </w:tc>
@@ -6583,17 +5974,8 @@
           <w:rFonts w:ascii="Arial" w:eastAsia="Arial" w:hAnsi="Arial" w:cs="Arial"/>
           <w:color w:val="2C2C2A"/>
         </w:rPr>
-        <w:t xml:space="preserve">Change the sample text in main.py — paste a real decision memo and see what the graph </w:t>
-      </w:r>
-      <w:proofErr w:type="gramStart"/>
-      <w:r>
-        <w:rPr>
-          <w:rFonts w:ascii="Arial" w:eastAsia="Arial" w:hAnsi="Arial" w:cs="Arial"/>
-          <w:color w:val="2C2C2A"/>
-        </w:rPr>
-        <w:t>extracts</w:t>
-      </w:r>
-      <w:proofErr w:type="gramEnd"/>
+        <w:t>Change the sample text in main.py — paste a real decision memo and see what the graph extracts</w:t>
+      </w:r>
     </w:p>
     <w:p>
       <w:pPr>
@@ -6609,17 +5991,8 @@
           <w:rFonts w:ascii="Arial" w:eastAsia="Arial" w:hAnsi="Arial" w:cs="Arial"/>
           <w:color w:val="2C2C2A"/>
         </w:rPr>
-        <w:t xml:space="preserve">Query the graph visually — run it, then explore http://localhost:7474 with MATCH (n) RETURN </w:t>
-      </w:r>
-      <w:proofErr w:type="gramStart"/>
-      <w:r>
-        <w:rPr>
-          <w:rFonts w:ascii="Arial" w:eastAsia="Arial" w:hAnsi="Arial" w:cs="Arial"/>
-          <w:color w:val="2C2C2A"/>
-        </w:rPr>
-        <w:t>n</w:t>
-      </w:r>
-      <w:proofErr w:type="gramEnd"/>
+        <w:t>Query the graph visually — run it, then explore http://localhost:7474 with MATCH (n) RETURN n</w:t>
+      </w:r>
     </w:p>
     <w:p>
       <w:pPr>
@@ -6635,17 +6008,8 @@
           <w:rFonts w:ascii="Arial" w:eastAsia="Arial" w:hAnsi="Arial" w:cs="Arial"/>
           <w:color w:val="2C2C2A"/>
         </w:rPr>
-        <w:t xml:space="preserve">Add a second decision — run it twice with different text and watch the graph </w:t>
-      </w:r>
-      <w:proofErr w:type="gramStart"/>
-      <w:r>
-        <w:rPr>
-          <w:rFonts w:ascii="Arial" w:eastAsia="Arial" w:hAnsi="Arial" w:cs="Arial"/>
-          <w:color w:val="2C2C2A"/>
-        </w:rPr>
-        <w:t>grow</w:t>
-      </w:r>
-      <w:proofErr w:type="gramEnd"/>
+        <w:t>Add a second decision — run it twice with different text and watch the graph grow</w:t>
+      </w:r>
     </w:p>
     <w:p>
       <w:pPr>
@@ -6661,17 +6025,8 @@
           <w:rFonts w:ascii="Arial" w:eastAsia="Arial" w:hAnsi="Arial" w:cs="Arial"/>
           <w:color w:val="2C2C2A"/>
         </w:rPr>
-        <w:t xml:space="preserve">Try semantic search — run step2_vector_memory.py and see how it finds docs by meaning, not </w:t>
-      </w:r>
-      <w:proofErr w:type="gramStart"/>
-      <w:r>
-        <w:rPr>
-          <w:rFonts w:ascii="Arial" w:eastAsia="Arial" w:hAnsi="Arial" w:cs="Arial"/>
-          <w:color w:val="2C2C2A"/>
-        </w:rPr>
-        <w:t>keywords</w:t>
-      </w:r>
-      <w:proofErr w:type="gramEnd"/>
+        <w:t>Try semantic search — run step2_vector_memory.py and see how it finds docs by meaning, not keywords</w:t>
+      </w:r>
     </w:p>
     <w:p>
       <w:pPr>
@@ -6686,7 +6041,6 @@
         <w:spacing w:before="160"/>
         <w:jc w:val="center"/>
       </w:pPr>
-      <w:proofErr w:type="spellStart"/>
       <w:r>
         <w:rPr>
           <w:rFonts w:ascii="Arial" w:eastAsia="Arial" w:hAnsi="Arial" w:cs="Arial"/>
@@ -6695,62 +6049,7 @@
           <w:sz w:val="16"/>
           <w:szCs w:val="16"/>
         </w:rPr>
-        <w:t>DecisionFormation</w:t>
-      </w:r>
-      <w:proofErr w:type="spellEnd"/>
-      <w:r>
-        <w:rPr>
-          <w:rFonts w:ascii="Arial" w:eastAsia="Arial" w:hAnsi="Arial" w:cs="Arial"/>
-          <w:color w:val="888880"/>
-          <w:spacing w:val="40"/>
-          <w:sz w:val="16"/>
-          <w:szCs w:val="16"/>
-        </w:rPr>
-        <w:t xml:space="preserve"> </w:t>
-      </w:r>
-      <w:proofErr w:type="gramStart"/>
-      <w:r>
-        <w:rPr>
-          <w:rFonts w:ascii="Arial" w:eastAsia="Arial" w:hAnsi="Arial" w:cs="Arial"/>
-          <w:color w:val="888880"/>
-          <w:spacing w:val="40"/>
-          <w:sz w:val="16"/>
-          <w:szCs w:val="16"/>
-        </w:rPr>
-        <w:t>Lab  ·</w:t>
-      </w:r>
-      <w:proofErr w:type="gramEnd"/>
-      <w:r>
-        <w:rPr>
-          <w:rFonts w:ascii="Arial" w:eastAsia="Arial" w:hAnsi="Arial" w:cs="Arial"/>
-          <w:color w:val="888880"/>
-          <w:spacing w:val="40"/>
-          <w:sz w:val="16"/>
-          <w:szCs w:val="16"/>
-        </w:rPr>
-        <w:t xml:space="preserve">  </w:t>
-      </w:r>
-      <w:proofErr w:type="gramStart"/>
-      <w:r>
-        <w:rPr>
-          <w:rFonts w:ascii="Arial" w:eastAsia="Arial" w:hAnsi="Arial" w:cs="Arial"/>
-          <w:color w:val="888880"/>
-          <w:spacing w:val="40"/>
-          <w:sz w:val="16"/>
-          <w:szCs w:val="16"/>
-        </w:rPr>
-        <w:t>korum-os.com  ·</w:t>
-      </w:r>
-      <w:proofErr w:type="gramEnd"/>
-      <w:r>
-        <w:rPr>
-          <w:rFonts w:ascii="Arial" w:eastAsia="Arial" w:hAnsi="Arial" w:cs="Arial"/>
-          <w:color w:val="888880"/>
-          <w:spacing w:val="40"/>
-          <w:sz w:val="16"/>
-          <w:szCs w:val="16"/>
-        </w:rPr>
-        <w:t xml:space="preserve">  Internal Use Only</w:t>
+        <w:t>DecisionFormation Lab  ·  korum-os.com  ·  Internal Use Only</w:t>
       </w:r>
     </w:p>
     <w:sectPr>

</xml_diff>